<commit_message>
docs: rellenar sección 3.5 integración técnica en el reporte Word
</commit_message>
<xml_diff>
--- a/tutorial/Reporte_Entrega3_final-2.docx
+++ b/tutorial/Reporte_Entrega3_final-2.docx
@@ -6705,12 +6705,51 @@
           <w:highlight w:val="yellow"/>
           <w:rtl w:val="0"/>
         </w:rPr>
-        <w:t xml:space="preserve">describir</w:t>
+        <w:t>El despliegue local se apoya en dos contenedores Docker independientes coordinados por Docker Compose. El contenedor de la API se construye a partir de docker/api.Dockerfile, usando una arquitectura multi-stage sobre python:3.13-slim: la primera etapa instala las dependencias en un prefijo aislado y la segunda copia solo los artefactos necesarios, manteniendo la imagen de producción libre de herramientas de compilación. El proceso corre bajo el usuario appuser (uid 10001, sin privilegios de root), expone el puerto 8001 y arranca con uvicorn api.app.functional:app, que es la aplicación completamente ensamblada con persistencia y orquestación activas. La ruta de la base de datos SQLite se controla mediante la variable de entorno BIOMAC_DB_PATH; en ejecución local apunta a runtime/biomac.db dentro del contenedor, y en el despliegue sobre AWS ECS ese directorio se sustituye por un volumen EFS propiedad del mismo uid, sin cambios en el Dockerfile.</w:t>
       </w:r>
       <w:r>
         <w:rPr>
           <w:rtl w:val="0"/>
         </w:rPr>
+      </w:r>
+    </w:p>
+    <w:p>
+      <w:pPr>
+        <w:spacing w:after="0" w:lineRule="auto"/>
+        <w:ind w:left="0" w:firstLine="0"/>
+        <w:jc w:val="both"/>
+        <w:rPr>
+          <w:highlight w:val="yellow"/>
+        </w:rPr>
+      </w:pPr>
+      <w:r>
+        <w:t xml:space="preserve">El contenedor del dashboard se construye a partir del Dockerfile ubicado junto al código fuente en dashboard_prototipos/dengue-watch-pro/. Utiliza también una arquitectura multi-stage: la etapa de build corre sobre oven/bun:1-slim y genera un servidor Node.js (preset node-server de Nitro) mediante bun run build; la etapa de producción corre sobre node:22-slim con el mismo usuario no privilegiado (uid 10001) y expone el puerto 3000. La URL de la API (VITE_BIOMAC_API_BASE_URL) se inyecta como argumento de build y queda incorporada en el bundle estático; el valor local (http://localhost:8001/api/v2) debe ser alcanzable tanto desde el navegador del usuario como desde cualquier fetch del proceso Node del dashboard.</w:t>
+      </w:r>
+    </w:p>
+    <w:p>
+      <w:pPr>
+        <w:spacing w:after="0" w:lineRule="auto"/>
+        <w:ind w:left="0" w:firstLine="0"/>
+        <w:jc w:val="both"/>
+        <w:rPr>
+          <w:highlight w:val="yellow"/>
+        </w:rPr>
+      </w:pPr>
+      <w:r>
+        <w:t xml:space="preserve">Ambos servicios se orquestan mediante docker-compose.yml con network_mode: host, lo que hace que los puertos 8001 y 3000 queden vinculados directamente a la interfaz de red del host. Esta configuración garantiza que la URL baked-in apunte al mismo endpoint tanto desde el browser como desde el proceso Node, replicando el comportamiento que en AWS logran los dos servicios apuntando al mismo nombre de DNS del ALB. En Railway, la misma configuración de Dockerfiles se mantiene; la plataforma inyecta VITE_BIOMAC_API_BASE_URL como variable de entorno en tiempo de build apuntando a la URL pública del servicio de API.</w:t>
+      </w:r>
+    </w:p>
+    <w:p>
+      <w:pPr>
+        <w:spacing w:after="0" w:lineRule="auto"/>
+        <w:ind w:left="0" w:firstLine="0"/>
+        <w:jc w:val="both"/>
+        <w:rPr>
+          <w:highlight w:val="yellow"/>
+        </w:rPr>
+      </w:pPr>
+      <w:r>
+        <w:t xml:space="preserve">El operador solo necesita tres comandos: make up para construir las imágenes y levantar los servicios (incluyendo la instalación automática de Docker si no está presente, vía .install-biomac.sh), make down para detener los contenedores, y make delete para eliminar también las imágenes y volúmenes locales. Los manuales de instalación y usuario, incluidos en tutorial/, documentan en detalle cada variante de sistema operativo (Linux nativo, macOS y Windows vía WSL2).</w:t>
       </w:r>
     </w:p>
     <w:p>

</xml_diff>

<commit_message>
docs: reporte E3 — intro sección 2.3, quitar highlights resueltos, eliminar sección 9
</commit_message>
<xml_diff>
--- a/tutorial/Reporte_Entrega3_final-2.docx
+++ b/tutorial/Reporte_Entrega3_final-2.docx
@@ -2457,10 +2457,9 @@
         <w:rPr>
           <w:sz w:val="22"/>
           <w:szCs w:val="22"/>
-          <w:highlight w:val="yellow"/>
           <w:rtl w:val="0"/>
         </w:rPr>
-        <w:t xml:space="preserve">Pendiente texto introductorio</w:t>
+        <w:t>La evaluación se realiza sobre el conjunto de prueba (2023–2025) para T+1 y T+2, comparando todos los modelos bajo el mismo protocolo de ventana expansiva y recalculando el canal endémico dentro de cada partición. Los resultados se reportan en tres dimensiones: desempeño global (F1, PR-AUC, AUROC), capacidad de detectar inicios de brote y tasa de falsas alarmas. La tabla comparativa y las curvas ROC y Precision-Recall se generaron a partir de las corridas registradas en MLflow con params.conjunto = prueba.</w:t>
       </w:r>
     </w:p>
     <w:tbl>
@@ -6702,7 +6701,6 @@
         <w:rPr>
           <w:sz w:val="22"/>
           <w:szCs w:val="22"/>
-          <w:highlight w:val="yellow"/>
           <w:rtl w:val="0"/>
         </w:rPr>
         <w:t>El despliegue local se apoya en dos contenedores Docker independientes coordinados por Docker Compose. El contenedor de la API se construye a partir de docker/api.Dockerfile, usando una arquitectura multi-stage sobre python:3.13-slim: la primera etapa instala las dependencias en un prefijo aislado y la segunda copia solo los artefactos necesarios, manteniendo la imagen de producción libre de herramientas de compilación. El proceso corre bajo el usuario appuser (uid 10001, sin privilegios de root), expone el puerto 8001 y arranca con uvicorn api.app.functional:app, que es la aplicación completamente ensamblada con persistencia y orquestación activas. La ruta de la base de datos SQLite se controla mediante la variable de entorno BIOMAC_DB_PATH; en ejecución local apunta a runtime/biomac.db dentro del contenedor, y en el despliegue sobre AWS ECS ese directorio se sustituye por un volumen EFS propiedad del mismo uid, sin cambios en el Dockerfile.</w:t>
@@ -7018,7 +7016,6 @@
           <w:color w:val="203040"/>
           <w:sz w:val="22"/>
           <w:szCs w:val="22"/>
-          <w:highlight w:val="yellow"/>
           <w:u w:val="none"/>
           <w:vertAlign w:val="baseline"/>
           <w:rtl w:val="0"/>
@@ -7398,39 +7395,6 @@
         <w:rPr>
           <w:rtl w:val="0"/>
         </w:rPr>
-      </w:r>
-    </w:p>
-    <w:p>
-      <w:pPr>
-        <w:pStyle w:val="Heading1"/>
-        <w:jc w:val="both"/>
-        <w:rPr>
-          <w:sz w:val="22"/>
-          <w:szCs w:val="22"/>
-        </w:rPr>
-      </w:pPr>
-      <w:r>
-        <w:rPr>
-          <w:rtl w:val="0"/>
-        </w:rPr>
-      </w:r>
-    </w:p>
-    <w:p>
-      <w:pPr>
-        <w:pStyle w:val="Heading1"/>
-        <w:jc w:val="both"/>
-        <w:rPr>
-          <w:sz w:val="22"/>
-          <w:szCs w:val="22"/>
-        </w:rPr>
-      </w:pPr>
-      <w:r>
-        <w:rPr>
-          <w:sz w:val="22"/>
-          <w:szCs w:val="22"/>
-          <w:rtl w:val="0"/>
-        </w:rPr>
-        <w:t xml:space="preserve">9. Reporte de trabajo en equipo</w:t>
       </w:r>
     </w:p>
     <w:tbl>
@@ -8229,34 +8193,6 @@
         </w:tc>
       </w:tr>
     </w:tbl>
-    <w:p>
-      <w:pPr>
-        <w:keepNext w:val="0"/>
-        <w:keepLines w:val="0"/>
-        <w:pageBreakBefore w:val="0"/>
-        <w:widowControl w:val="0"/>
-        <w:pBdr>
-          <w:top w:space="0" w:sz="0" w:val="nil"/>
-          <w:left w:space="0" w:sz="0" w:val="nil"/>
-          <w:bottom w:space="0" w:sz="0" w:val="nil"/>
-          <w:right w:space="0" w:sz="0" w:val="nil"/>
-          <w:between w:space="0" w:sz="0" w:val="nil"/>
-        </w:pBdr>
-        <w:shd w:fill="auto" w:val="clear"/>
-        <w:spacing w:after="0" w:before="0" w:line="276" w:lineRule="auto"/>
-        <w:ind w:left="0" w:right="0" w:firstLine="0"/>
-        <w:jc w:val="both"/>
-        <w:rPr>
-          <w:sz w:val="22"/>
-          <w:szCs w:val="22"/>
-        </w:rPr>
-      </w:pPr>
-      <w:r>
-        <w:rPr>
-          <w:rtl w:val="0"/>
-        </w:rPr>
-      </w:r>
-    </w:p>
     <w:sectPr>
       <w:headerReference r:id="rId10" w:type="default"/>
       <w:headerReference r:id="rId11" w:type="first"/>

</xml_diff>

<commit_message>
docs: insertar figuras de feature importance, ROC/PR e inicios de brote en reporte
Reemplaza los 3 placeholders de imagen con las figuras generadas:
- data/figures/report_feature_importance.png → p40
- data/figures/report_roc_pr.png → p56
- data/figures/report_inicios_brote.png → p57
</commit_message>
<xml_diff>
--- a/tutorial/Reporte_Entrega3_final-2.docx
+++ b/tutorial/Reporte_Entrega3_final-2.docx
@@ -2316,23 +2316,49 @@
         </w:rPr>
       </w:pPr>
       <w:r>
-        <w:rPr>
-          <w:rFonts w:ascii="Arial" w:hAnsi="Arial" w:eastAsia="Arial" w:cs="Arial"/>
-          <w:b w:val="0"/>
-          <w:bCs w:val="0"/>
-          <w:i w:val="1"/>
-          <w:iCs w:val="1"/>
-          <w:color w:val="5b677a"/>
-          <w:sz w:val="22"/>
-          <w:szCs w:val="22"/>
-          <w:lang w:val="en-US"/>
-        </w:rPr>
-        <w:t xml:space="preserve">[Imagen "Importancia de características del Champion vigente, regenerada después del reentrenamiento; resaltar brote_lag_1, SIR y variables del canal endémico"]</w:t>
+        <w:drawing>
+          <wp:inline>
+            <wp:extent cx="5029200" cy="3333964"/>
+            <wp:docPr id="2033299070" name="Picture 2033299070"/>
+            <wp:cNvGraphicFramePr>
+              <a:graphicFrameLocks noChangeAspect="1"/>
+            </wp:cNvGraphicFramePr>
+            <a:graphic>
+              <a:graphicData uri="http://schemas.openxmlformats.org/drawingml/2006/picture">
+                <pic:pic>
+                  <pic:nvPicPr>
+                    <pic:cNvPr id="0" name="report_feature_importance.png"/>
+                    <pic:cNvPicPr/>
+                  </pic:nvPicPr>
+                  <pic:blipFill>
+                    <a:blip r:embed="rId7"/>
+                    <a:stretch>
+                      <a:fillRect/>
+                    </a:stretch>
+                  </pic:blipFill>
+                  <pic:spPr>
+                    <a:xfrm>
+                      <a:off x="0" y="0"/>
+                      <a:ext cx="5029200" cy="3333964"/>
+                    </a:xfrm>
+                    <a:prstGeom prst="rect"/>
+                  </pic:spPr>
+                </pic:pic>
+              </a:graphicData>
+            </a:graphic>
+          </wp:inline>
+        </w:drawing>
       </w:r>
+    </w:p>
+    <w:p>
+      <w:pPr>
+        <w:pStyle w:val="Caption"/>
+      </w:pPr>
       <w:r>
         <w:rPr>
-          <w:rtl w:val="0"/>
-        </w:rPr>
+          <w:i/>
+        </w:rPr>
+        <w:t>Figura: Importancia de características — XGBoost Champion (conjunto de prueba)</w:t>
       </w:r>
     </w:p>
     <w:p xmlns:wp14="http://schemas.microsoft.com/office/word/2010/wordml" wp14:textId="77777777">
@@ -4893,23 +4919,49 @@
         </w:rPr>
       </w:pPr>
       <w:r>
-        <w:rPr>
-          <w:rFonts w:ascii="Arial" w:hAnsi="Arial" w:eastAsia="Arial" w:cs="Arial"/>
-          <w:b w:val="0"/>
-          <w:bCs w:val="0"/>
-          <w:i w:val="1"/>
-          <w:iCs w:val="1"/>
-          <w:color w:val="5b677a"/>
-          <w:sz w:val="22"/>
-          <w:szCs w:val="22"/>
-          <w:lang w:val="en-US"/>
-        </w:rPr>
-        <w:t xml:space="preserve">[Imagen "Curvas ROC y Precision-Recall regeneradas para las corridas comparables del conjunto de prueba"]</w:t>
+        <w:drawing>
+          <wp:inline>
+            <wp:extent cx="5029200" cy="2049037"/>
+            <wp:docPr id="2033299071" name="Picture 2033299071"/>
+            <wp:cNvGraphicFramePr>
+              <a:graphicFrameLocks noChangeAspect="1"/>
+            </wp:cNvGraphicFramePr>
+            <a:graphic>
+              <a:graphicData uri="http://schemas.openxmlformats.org/drawingml/2006/picture">
+                <pic:pic>
+                  <pic:nvPicPr>
+                    <pic:cNvPr id="0" name="report_roc_pr.png"/>
+                    <pic:cNvPicPr/>
+                  </pic:nvPicPr>
+                  <pic:blipFill>
+                    <a:blip r:embed="rId14"/>
+                    <a:stretch>
+                      <a:fillRect/>
+                    </a:stretch>
+                  </pic:blipFill>
+                  <pic:spPr>
+                    <a:xfrm>
+                      <a:off x="0" y="0"/>
+                      <a:ext cx="5029200" cy="2049037"/>
+                    </a:xfrm>
+                    <a:prstGeom prst="rect"/>
+                  </pic:spPr>
+                </pic:pic>
+              </a:graphicData>
+            </a:graphic>
+          </wp:inline>
+        </w:drawing>
       </w:r>
+    </w:p>
+    <w:p>
+      <w:pPr>
+        <w:pStyle w:val="Caption"/>
+      </w:pPr>
       <w:r>
         <w:rPr>
-          <w:rtl w:val="0"/>
-        </w:rPr>
+          <w:i/>
+        </w:rPr>
+        <w:t>Figura: Curvas ROC y Precision-Recall — conjunto de prueba (2024-2025)</w:t>
       </w:r>
     </w:p>
     <w:p xmlns:wp14="http://schemas.microsoft.com/office/word/2010/wordml" wp14:textId="77777777">
@@ -4925,23 +4977,49 @@
         </w:rPr>
       </w:pPr>
       <w:r>
-        <w:rPr>
-          <w:rFonts w:ascii="Arial" w:hAnsi="Arial" w:eastAsia="Arial" w:cs="Arial"/>
-          <w:b w:val="0"/>
-          <w:bCs w:val="0"/>
-          <w:i w:val="1"/>
-          <w:iCs w:val="1"/>
-          <w:color w:val="5b677a"/>
-          <w:sz w:val="22"/>
-          <w:szCs w:val="22"/>
-          <w:lang w:val="en-US"/>
-        </w:rPr>
-        <w:t xml:space="preserve">[Imagen "Comparación de inicios de brote detectados por XGBoost, LightGBM, canal endémico, persistencia, Poisson y GAM"]</w:t>
+        <w:drawing>
+          <wp:inline>
+            <wp:extent cx="5029200" cy="2235200"/>
+            <wp:docPr id="2033299072" name="Picture 2033299072"/>
+            <wp:cNvGraphicFramePr>
+              <a:graphicFrameLocks noChangeAspect="1"/>
+            </wp:cNvGraphicFramePr>
+            <a:graphic>
+              <a:graphicData uri="http://schemas.openxmlformats.org/drawingml/2006/picture">
+                <pic:pic>
+                  <pic:nvPicPr>
+                    <pic:cNvPr id="0" name="report_inicios_brote.png"/>
+                    <pic:cNvPicPr/>
+                  </pic:nvPicPr>
+                  <pic:blipFill>
+                    <a:blip r:embed="rId15"/>
+                    <a:stretch>
+                      <a:fillRect/>
+                    </a:stretch>
+                  </pic:blipFill>
+                  <pic:spPr>
+                    <a:xfrm>
+                      <a:off x="0" y="0"/>
+                      <a:ext cx="5029200" cy="2235200"/>
+                    </a:xfrm>
+                    <a:prstGeom prst="rect"/>
+                  </pic:spPr>
+                </pic:pic>
+              </a:graphicData>
+            </a:graphic>
+          </wp:inline>
+        </w:drawing>
       </w:r>
+    </w:p>
+    <w:p>
+      <w:pPr>
+        <w:pStyle w:val="Caption"/>
+      </w:pPr>
       <w:r>
         <w:rPr>
-          <w:rtl w:val="0"/>
-        </w:rPr>
+          <w:i/>
+        </w:rPr>
+        <w:t>Figura: Detección de inicios de brote por modelo — conjunto de prueba (2024-2025)</w:t>
       </w:r>
     </w:p>
     <w:p xmlns:wp14="http://schemas.microsoft.com/office/word/2010/wordml" wp14:textId="77777777">

</xml_diff>

<commit_message>
docs: actualizar reporte con versión Stevan (1) e insertar figuras de modelos
- Base: Reporte_Entrega3_final-Stevan (1).docx con imágenes adicionales de Stevan
- Insertadas: feature importance (p43), ROC/PR (p60), inicios de brote (p61)
</commit_message>
<xml_diff>
--- a/tutorial/Reporte_Entrega3_final-2.docx
+++ b/tutorial/Reporte_Entrega3_final-2.docx
@@ -625,137 +625,46 @@
         <w:t>1.3 Conjuntos de datos</w:t>
       </w:r>
     </w:p>
+    <w:p>
+      <w:pPr>
+        <w:spacing w:before="0" w:after="40" w:line="240" w:lineRule="auto"/>
+        <w:jc w:val="both"/>
+        <w:rPr>
+          <w:rFonts w:ascii="Arial" w:hAnsi="Arial" w:eastAsia="Arial" w:cs="Arial"/>
+          <w:b w:val="0"/>
+          <w:bCs w:val="0"/>
+          <w:i w:val="0"/>
+          <w:iCs w:val="0"/>
+          <w:color w:val="203040"/>
+          <w:sz w:val="22"/>
+          <w:szCs w:val="22"/>
+          <w:lang w:val="en-US"/>
+        </w:rPr>
+      </w:pPr>
+    </w:p>
     <w:tbl>
       <w:tblPr>
-        <w:tblStyle w:val="Table1"/>
-        <w:tblW w:w="10570" w:type="dxa"/>
-        <w:jc w:val="center"/>
-        <w:tblBorders>
-          <w:top w:val="single" w:color="b8c6d8" w:sz="4" w:space="0"/>
-          <w:left w:val="single" w:color="b8c6d8" w:sz="4" w:space="0"/>
-          <w:bottom w:val="single" w:color="b8c6d8" w:sz="4" w:space="0"/>
-          <w:right w:val="single" w:color="b8c6d8" w:sz="4" w:space="0"/>
-          <w:insideH w:val="single" w:color="b8c6d8" w:sz="4" w:space="0"/>
-          <w:insideV w:val="single" w:color="b8c6d8" w:sz="4" w:space="0"/>
-        </w:tblBorders>
-        <w:tblLayout w:type="fixed"/>
-        <w:tblLook w:val="0400"/>
-        <w:tblPrChange w:author="" w:id="676618564">
-          <w:tblPr/>
-        </w:tblPrChange>
+        <w:tblStyle w:val="TableGrid"/>
+        <w:tblW w:w="0" w:type="auto"/>
+        <w:tblLook w:val="06A0" w:firstRow="1" w:lastRow="0" w:firstColumn="1" w:lastColumn="0" w:noHBand="1" w:noVBand="1"/>
       </w:tblPr>
       <w:tblGrid>
-        <w:gridCol w:w="5285"/>
-        <w:gridCol w:w="5285"/>
+        <w:gridCol w:w="5280"/>
+        <w:gridCol w:w="5280"/>
       </w:tblGrid>
-      <w:tr xmlns:wp14="http://schemas.microsoft.com/office/word/2010/wordml" wp14:textId="77777777">
+      <w:tr>
         <w:trPr>
-          <w:cantSplit w:val="0"/>
-          <w:tblHeader w:val="1"/>
+          <w:trHeight w:val="300"/>
         </w:trPr>
         <w:tc>
           <w:tcPr>
-            <w:shd w:val="clear" w:color="auto" w:fill="D5E5F5"/>
-            <w:tcMar>
-              <w:top w:w="45.0" w:type="dxa"/>
-              <w:bottom w:w="45.0" w:type="dxa"/>
-            </w:tcMar>
-            <w:vAlign w:val="center"/>
+            <w:tcW w:w="5280" w:type="dxa"/>
+            <w:shd w:val="clear" w:color="auto" w:fill="DBE5F1" w:themeFill="accent1" w:themeFillTint="33"/>
+            <w:tcMar/>
           </w:tcPr>
-          <w:p wp14:textId="77777777">
+          <w:p>
             <w:pPr>
-              <w:spacing w:before="0" w:after="0" w:line="240" w:lineRule="auto"/>
-              <w:jc w:val="both"/>
-              <w:rPr>
-                <w:sz w:val="22"/>
-                <w:szCs w:val="22"/>
-                <w:lang w:val="en-US"/>
-              </w:rPr>
-            </w:pPr>
-            <w:r>
-              <w:rPr>
-                <w:rFonts w:ascii="Arial" w:hAnsi="Arial" w:eastAsia="Arial" w:cs="Arial"/>
-                <w:b w:val="1"/>
-                <w:bCs w:val="1"/>
-                <w:i w:val="0"/>
-                <w:iCs w:val="0"/>
-                <w:color w:val="203040"/>
-                <w:sz w:val="22"/>
-                <w:szCs w:val="22"/>
-                <w:lang w:val="en-US"/>
-              </w:rPr>
-              <w:t xml:space="preserve">Fuente / alcance</w:t>
-            </w:r>
-            <w:r>
-              <w:rPr>
-                <w:rtl w:val="0"/>
-              </w:rPr>
-            </w:r>
-          </w:p>
-        </w:tc>
-        <w:tc>
-          <w:tcPr>
-            <w:shd w:val="clear" w:color="auto" w:fill="D5E5F5"/>
-            <w:tcMar>
-              <w:top w:w="45.0" w:type="dxa"/>
-              <w:bottom w:w="45.0" w:type="dxa"/>
-            </w:tcMar>
-            <w:vAlign w:val="center"/>
-          </w:tcPr>
-          <w:p wp14:textId="77777777">
-            <w:pPr>
-              <w:spacing w:before="0" w:after="0" w:line="240" w:lineRule="auto"/>
-              <w:jc w:val="both"/>
-              <w:rPr>
-                <w:sz w:val="22"/>
-                <w:szCs w:val="22"/>
-                <w:lang w:val="en-US"/>
-              </w:rPr>
-            </w:pPr>
-            <w:r>
-              <w:rPr>
-                <w:rFonts w:ascii="Arial" w:hAnsi="Arial" w:eastAsia="Arial" w:cs="Arial"/>
-                <w:b w:val="1"/>
-                <w:bCs w:val="1"/>
-                <w:i w:val="0"/>
-                <w:iCs w:val="0"/>
-                <w:color w:val="203040"/>
-                <w:sz w:val="22"/>
-                <w:szCs w:val="22"/>
-                <w:lang w:val="en-US"/>
-              </w:rPr>
-              <w:t xml:space="preserve">Uso en la solución</w:t>
-            </w:r>
-            <w:r>
-              <w:rPr>
-                <w:rtl w:val="0"/>
-              </w:rPr>
-            </w:r>
-          </w:p>
-        </w:tc>
-      </w:tr>
-      <w:tr xmlns:wp14="http://schemas.microsoft.com/office/word/2010/wordml" wp14:textId="77777777">
-        <w:trPr>
-          <w:cantSplit w:val="0"/>
-          <w:tblHeader w:val="0"/>
-        </w:trPr>
-        <w:tc>
-          <w:tcPr>
-            <w:tcMar>
-              <w:top w:w="45.0" w:type="dxa"/>
-              <w:bottom w:w="45.0" w:type="dxa"/>
-            </w:tcMar>
-            <w:vAlign w:val="top"/>
-          </w:tcPr>
-          <w:p wp14:textId="77777777">
-            <w:pPr>
-              <w:spacing w:before="0" w:after="0" w:line="240" w:lineRule="auto"/>
-              <w:jc w:val="both"/>
-              <w:rPr>
-                <w:sz w:val="22"/>
-                <w:szCs w:val="22"/>
-                <w:lang w:val="en-US"/>
-              </w:rPr>
+              <w:pStyle w:val="Normal"/>
             </w:pPr>
             <w:r>
               <w:rPr>
@@ -769,32 +678,20 @@
                 <w:szCs w:val="22"/>
                 <w:lang w:val="en-US"/>
               </w:rPr>
-              <w:t xml:space="preserve">SIVIGILA dengue total, evento 210 · 1.585.040 registros (2007–2024)</w:t>
-            </w:r>
-            <w:r>
-              <w:rPr>
-                <w:rtl w:val="0"/>
-              </w:rPr>
+              <w:t>Fuente / alcance</w:t>
             </w:r>
           </w:p>
         </w:tc>
         <w:tc>
           <w:tcPr>
-            <w:tcMar>
-              <w:top w:w="45.0" w:type="dxa"/>
-              <w:bottom w:w="45.0" w:type="dxa"/>
-            </w:tcMar>
-            <w:vAlign w:val="top"/>
+            <w:tcW w:w="5280" w:type="dxa"/>
+            <w:shd w:val="clear" w:color="auto" w:fill="DBE5F1" w:themeFill="accent1" w:themeFillTint="33"/>
+            <w:tcMar/>
           </w:tcPr>
-          <w:p wp14:textId="77777777">
+          <w:p>
             <w:pPr>
-              <w:spacing w:before="0" w:after="0" w:line="240" w:lineRule="auto"/>
+              <w:spacing w:before="0" w:after="40" w:line="240" w:lineRule="auto"/>
               <w:jc w:val="both"/>
-              <w:rPr>
-                <w:sz w:val="22"/>
-                <w:szCs w:val="22"/>
-                <w:lang w:val="en-US"/>
-              </w:rPr>
             </w:pPr>
             <w:r>
               <w:rPr>
@@ -808,40 +705,8 @@
                 <w:szCs w:val="22"/>
                 <w:lang w:val="en-US"/>
               </w:rPr>
-              <w:t xml:space="preserve">Serie epidemiológica principal y definición del exceso respecto al canal endémico.</w:t>
-            </w:r>
-            <w:r>
-              <w:rPr>
-                <w:rtl w:val="0"/>
-              </w:rPr>
-            </w:r>
-          </w:p>
-        </w:tc>
-      </w:tr>
-      <w:tr xmlns:wp14="http://schemas.microsoft.com/office/word/2010/wordml" wp14:textId="77777777">
-        <w:trPr>
-          <w:cantSplit w:val="0"/>
-          <w:tblHeader w:val="0"/>
-        </w:trPr>
-        <w:tc>
-          <w:tcPr>
-            <w:shd w:val="clear" w:color="auto" w:fill="FAFBFC"/>
-            <w:tcMar>
-              <w:top w:w="45.0" w:type="dxa"/>
-              <w:bottom w:w="45.0" w:type="dxa"/>
-            </w:tcMar>
-            <w:vAlign w:val="top"/>
-          </w:tcPr>
-          <w:p wp14:textId="77777777">
-            <w:pPr>
-              <w:spacing w:before="0" w:after="0" w:line="240" w:lineRule="auto"/>
-              <w:jc w:val="both"/>
-              <w:rPr>
-                <w:sz w:val="22"/>
-                <w:szCs w:val="22"/>
-                <w:lang w:val="en-US"/>
-              </w:rPr>
-            </w:pPr>
+              <w:t xml:space="preserve">Uso </w:t>
+            </w:r>
             <w:r>
               <w:rPr>
                 <w:rFonts w:ascii="Arial" w:hAnsi="Arial" w:eastAsia="Arial" w:cs="Arial"/>
@@ -854,34 +719,8 @@
                 <w:szCs w:val="22"/>
                 <w:lang w:val="en-US"/>
               </w:rPr>
-              <w:t xml:space="preserve">SIVIGILA dengue grave, evento 220 · 48.823 registros (2007–2024)</w:t>
-            </w:r>
-            <w:r>
-              <w:rPr>
-                <w:rtl w:val="0"/>
-              </w:rPr>
-            </w:r>
-          </w:p>
-        </w:tc>
-        <w:tc>
-          <w:tcPr>
-            <w:shd w:val="clear" w:color="auto" w:fill="FAFBFC"/>
-            <w:tcMar>
-              <w:top w:w="45.0" w:type="dxa"/>
-              <w:bottom w:w="45.0" w:type="dxa"/>
-            </w:tcMar>
-            <w:vAlign w:val="top"/>
-          </w:tcPr>
-          <w:p wp14:textId="77777777">
-            <w:pPr>
-              <w:spacing w:before="0" w:after="0" w:line="240" w:lineRule="auto"/>
-              <w:jc w:val="both"/>
-              <w:rPr>
-                <w:sz w:val="22"/>
-                <w:szCs w:val="22"/>
-                <w:lang w:val="en-US"/>
-              </w:rPr>
-            </w:pPr>
+              <w:t>en</w:t>
+            </w:r>
             <w:r>
               <w:rPr>
                 <w:rFonts w:ascii="Arial" w:hAnsi="Arial" w:eastAsia="Arial" w:cs="Arial"/>
@@ -894,39 +733,8 @@
                 <w:szCs w:val="22"/>
                 <w:lang w:val="en-US"/>
               </w:rPr>
-              <w:t xml:space="preserve">Serie auxiliar y rezagos epidemiológicos.</w:t>
-            </w:r>
-            <w:r>
-              <w:rPr>
-                <w:rtl w:val="0"/>
-              </w:rPr>
-            </w:r>
-          </w:p>
-        </w:tc>
-      </w:tr>
-      <w:tr xmlns:wp14="http://schemas.microsoft.com/office/word/2010/wordml" wp14:textId="77777777">
-        <w:trPr>
-          <w:cantSplit w:val="0"/>
-          <w:tblHeader w:val="0"/>
-        </w:trPr>
-        <w:tc>
-          <w:tcPr>
-            <w:tcMar>
-              <w:top w:w="45.0" w:type="dxa"/>
-              <w:bottom w:w="45.0" w:type="dxa"/>
-            </w:tcMar>
-            <w:vAlign w:val="top"/>
-          </w:tcPr>
-          <w:p wp14:textId="77777777">
-            <w:pPr>
-              <w:spacing w:before="0" w:after="0" w:line="240" w:lineRule="auto"/>
-              <w:jc w:val="both"/>
-              <w:rPr>
-                <w:sz w:val="22"/>
-                <w:szCs w:val="22"/>
-                <w:lang w:val="en-US"/>
-              </w:rPr>
-            </w:pPr>
+              <w:t xml:space="preserve"> la </w:t>
+            </w:r>
             <w:r>
               <w:rPr>
                 <w:rFonts w:ascii="Arial" w:hAnsi="Arial" w:eastAsia="Arial" w:cs="Arial"/>
@@ -939,32 +747,23 @@
                 <w:szCs w:val="22"/>
                 <w:lang w:val="en-US"/>
               </w:rPr>
-              <w:t xml:space="preserve">Variables climáticas mensuales ERA5/CHIRPS · 9 covariables</w:t>
-            </w:r>
-            <w:r>
-              <w:rPr>
-                <w:rtl w:val="0"/>
-              </w:rPr>
+              <w:t>solución</w:t>
             </w:r>
           </w:p>
         </w:tc>
+      </w:tr>
+      <w:tr>
+        <w:trPr>
+          <w:trHeight w:val="300"/>
+        </w:trPr>
         <w:tc>
           <w:tcPr>
-            <w:tcMar>
-              <w:top w:w="45.0" w:type="dxa"/>
-              <w:bottom w:w="45.0" w:type="dxa"/>
-            </w:tcMar>
-            <w:vAlign w:val="top"/>
+            <w:tcW w:w="5280" w:type="dxa"/>
+            <w:tcMar/>
           </w:tcPr>
-          <w:p wp14:textId="77777777">
+          <w:p>
             <w:pPr>
-              <w:spacing w:before="0" w:after="0" w:line="240" w:lineRule="auto"/>
-              <w:jc w:val="both"/>
-              <w:rPr>
-                <w:sz w:val="22"/>
-                <w:szCs w:val="22"/>
-                <w:lang w:val="en-US"/>
-              </w:rPr>
+              <w:pStyle w:val="Normal"/>
             </w:pPr>
             <w:r>
               <w:rPr>
@@ -978,39 +777,18 @@
                 <w:szCs w:val="22"/>
                 <w:lang w:val="en-US"/>
               </w:rPr>
-              <w:t xml:space="preserve">Temperatura, rocío, lluvia, suelo, escorrentía, evaporación, viento y radiación; el Champion también usa rezagos climáticos.</w:t>
-            </w:r>
-            <w:r>
-              <w:rPr>
-                <w:rtl w:val="0"/>
-              </w:rPr>
+              <w:t>SIVIGILA dengue total, evento 210 · 1.585.040 registros (2007–2024)</w:t>
             </w:r>
           </w:p>
         </w:tc>
-      </w:tr>
-      <w:tr xmlns:wp14="http://schemas.microsoft.com/office/word/2010/wordml" wp14:textId="77777777">
-        <w:trPr>
-          <w:cantSplit w:val="0"/>
-          <w:tblHeader w:val="0"/>
-        </w:trPr>
         <w:tc>
           <w:tcPr>
-            <w:shd w:val="clear" w:color="auto" w:fill="FAFBFC"/>
-            <w:tcMar>
-              <w:top w:w="45.0" w:type="dxa"/>
-              <w:bottom w:w="45.0" w:type="dxa"/>
-            </w:tcMar>
-            <w:vAlign w:val="top"/>
+            <w:tcW w:w="5280" w:type="dxa"/>
+            <w:tcMar/>
           </w:tcPr>
-          <w:p wp14:textId="77777777">
+          <w:p>
             <w:pPr>
-              <w:spacing w:before="0" w:after="0" w:line="240" w:lineRule="auto"/>
-              <w:jc w:val="both"/>
-              <w:rPr>
-                <w:sz w:val="22"/>
-                <w:szCs w:val="22"/>
-                <w:lang w:val="en-US"/>
-              </w:rPr>
+              <w:pStyle w:val="Normal"/>
             </w:pPr>
             <w:r>
               <w:rPr>
@@ -1024,33 +802,23 @@
                 <w:szCs w:val="22"/>
                 <w:lang w:val="en-US"/>
               </w:rPr>
-              <w:t xml:space="preserve">Panel procesado · 1.114 municipios; piloto: Cali y Bucaramanga</w:t>
-            </w:r>
-            <w:r>
-              <w:rPr>
-                <w:rtl w:val="0"/>
-              </w:rPr>
+              <w:t>Serie epidemiológica principal y definición del exceso respecto al canal endémico.</w:t>
             </w:r>
           </w:p>
         </w:tc>
+      </w:tr>
+      <w:tr>
+        <w:trPr>
+          <w:trHeight w:val="300"/>
+        </w:trPr>
         <w:tc>
           <w:tcPr>
-            <w:shd w:val="clear" w:color="auto" w:fill="FAFBFC"/>
-            <w:tcMar>
-              <w:top w:w="45.0" w:type="dxa"/>
-              <w:bottom w:w="45.0" w:type="dxa"/>
-            </w:tcMar>
-            <w:vAlign w:val="top"/>
+            <w:tcW w:w="5280" w:type="dxa"/>
+            <w:tcMar/>
           </w:tcPr>
-          <w:p wp14:textId="77777777">
+          <w:p>
             <w:pPr>
-              <w:spacing w:before="0" w:after="0" w:line="240" w:lineRule="auto"/>
-              <w:jc w:val="both"/>
-              <w:rPr>
-                <w:sz w:val="22"/>
-                <w:szCs w:val="22"/>
-                <w:lang w:val="en-US"/>
-              </w:rPr>
+              <w:pStyle w:val="Normal"/>
             </w:pPr>
             <w:r>
               <w:rPr>
@@ -1064,17 +832,189 @@
                 <w:szCs w:val="22"/>
                 <w:lang w:val="en-US"/>
               </w:rPr>
-              <w:t xml:space="preserve">Panel municipio-mes con ceros explícitos. La fecha de referencia es inicio de síntomas (INI_SIN), con notificación como respaldo.</w:t>
-            </w:r>
-            <w:r>
-              <w:rPr>
-                <w:rtl w:val="0"/>
-              </w:rPr>
+              <w:t>SIVIGILA dengue grave, evento 220 · 48.823 registros (2007–2024)</w:t>
+            </w:r>
+          </w:p>
+        </w:tc>
+        <w:tc>
+          <w:tcPr>
+            <w:tcW w:w="5280" w:type="dxa"/>
+            <w:tcMar/>
+          </w:tcPr>
+          <w:p>
+            <w:pPr>
+              <w:pStyle w:val="Normal"/>
+              <w:rPr>
+                <w:rFonts w:ascii="Arial" w:hAnsi="Arial" w:eastAsia="Arial" w:cs="Arial"/>
+                <w:b w:val="0"/>
+                <w:bCs w:val="0"/>
+                <w:i w:val="0"/>
+                <w:iCs w:val="0"/>
+                <w:color w:val="203040"/>
+                <w:sz w:val="22"/>
+                <w:szCs w:val="22"/>
+                <w:lang w:val="en-US"/>
+              </w:rPr>
+            </w:pPr>
+            <w:r>
+              <w:rPr>
+                <w:rFonts w:ascii="Arial" w:hAnsi="Arial" w:eastAsia="Arial" w:cs="Arial"/>
+                <w:b w:val="0"/>
+                <w:bCs w:val="0"/>
+                <w:i w:val="0"/>
+                <w:iCs w:val="0"/>
+                <w:color w:val="203040"/>
+                <w:sz w:val="22"/>
+                <w:szCs w:val="22"/>
+                <w:lang w:val="en-US"/>
+              </w:rPr>
+              <w:t>Serie auxiliar y rezagos epidemiológicos</w:t>
+            </w:r>
+          </w:p>
+        </w:tc>
+      </w:tr>
+      <w:tr>
+        <w:trPr>
+          <w:trHeight w:val="300"/>
+        </w:trPr>
+        <w:tc>
+          <w:tcPr>
+            <w:tcW w:w="5280" w:type="dxa"/>
+            <w:tcMar/>
+          </w:tcPr>
+          <w:p>
+            <w:pPr>
+              <w:pStyle w:val="Normal"/>
+            </w:pPr>
+            <w:r>
+              <w:rPr>
+                <w:rFonts w:ascii="Arial" w:hAnsi="Arial" w:eastAsia="Arial" w:cs="Arial"/>
+                <w:b w:val="0"/>
+                <w:bCs w:val="0"/>
+                <w:i w:val="0"/>
+                <w:iCs w:val="0"/>
+                <w:color w:val="203040"/>
+                <w:sz w:val="22"/>
+                <w:szCs w:val="22"/>
+                <w:lang w:val="en-US"/>
+              </w:rPr>
+              <w:t>Variables climáticas mensuales ERA5/CHIRPS · 9 covariables</w:t>
+            </w:r>
+          </w:p>
+        </w:tc>
+        <w:tc>
+          <w:tcPr>
+            <w:tcW w:w="5280" w:type="dxa"/>
+            <w:tcMar/>
+          </w:tcPr>
+          <w:p>
+            <w:pPr>
+              <w:pStyle w:val="Normal"/>
+            </w:pPr>
+            <w:r>
+              <w:rPr>
+                <w:rFonts w:ascii="Arial" w:hAnsi="Arial" w:eastAsia="Arial" w:cs="Arial"/>
+                <w:b w:val="0"/>
+                <w:bCs w:val="0"/>
+                <w:i w:val="0"/>
+                <w:iCs w:val="0"/>
+                <w:color w:val="203040"/>
+                <w:sz w:val="22"/>
+                <w:szCs w:val="22"/>
+                <w:lang w:val="en-US"/>
+              </w:rPr>
+              <w:t>Temperatura, rocío, lluvia, suelo, escorrentía, evaporación, viento y radiación; el Champion también usa rezagos climáticos.</w:t>
+            </w:r>
+          </w:p>
+        </w:tc>
+      </w:tr>
+      <w:tr>
+        <w:trPr>
+          <w:trHeight w:val="300"/>
+        </w:trPr>
+        <w:tc>
+          <w:tcPr>
+            <w:tcW w:w="5280" w:type="dxa"/>
+            <w:tcMar/>
+          </w:tcPr>
+          <w:p>
+            <w:pPr>
+              <w:pStyle w:val="Normal"/>
+            </w:pPr>
+            <w:r>
+              <w:rPr>
+                <w:rFonts w:ascii="Arial" w:hAnsi="Arial" w:eastAsia="Arial" w:cs="Arial"/>
+                <w:b w:val="0"/>
+                <w:bCs w:val="0"/>
+                <w:i w:val="0"/>
+                <w:iCs w:val="0"/>
+                <w:color w:val="203040"/>
+                <w:sz w:val="22"/>
+                <w:szCs w:val="22"/>
+                <w:lang w:val="es-ES"/>
+              </w:rPr>
+              <w:t>Panel procesado · 1.114 municipios; piloto: Cali y Bucaramanga</w:t>
+            </w:r>
+          </w:p>
+        </w:tc>
+        <w:tc>
+          <w:tcPr>
+            <w:tcW w:w="5280" w:type="dxa"/>
+            <w:tcMar/>
+          </w:tcPr>
+          <w:p>
+            <w:pPr>
+              <w:pStyle w:val="Normal"/>
+            </w:pPr>
+            <w:r>
+              <w:rPr>
+                <w:rFonts w:ascii="Arial" w:hAnsi="Arial" w:eastAsia="Arial" w:cs="Arial"/>
+                <w:noProof w:val="0"/>
+                <w:color w:val="203040"/>
+                <w:sz w:val="22"/>
+                <w:szCs w:val="22"/>
+                <w:lang w:val="en-US"/>
+              </w:rPr>
+              <w:t>Panel municipio-mes con ceros explícitos. La fecha de referencia es inicio de síntomas (INI_SIN), con notificación como respaldo.</w:t>
             </w:r>
           </w:p>
         </w:tc>
       </w:tr>
     </w:tbl>
+    <w:p>
+      <w:pPr>
+        <w:spacing w:before="0" w:after="40" w:line="240" w:lineRule="auto"/>
+        <w:jc w:val="both"/>
+        <w:rPr>
+          <w:rFonts w:ascii="Arial" w:hAnsi="Arial" w:eastAsia="Arial" w:cs="Arial"/>
+          <w:b w:val="0"/>
+          <w:bCs w:val="0"/>
+          <w:i w:val="0"/>
+          <w:iCs w:val="0"/>
+          <w:color w:val="203040"/>
+          <w:sz w:val="22"/>
+          <w:szCs w:val="22"/>
+          <w:lang w:val="en-US"/>
+        </w:rPr>
+      </w:pPr>
+    </w:p>
+    <w:p>
+      <w:pPr>
+        <w:spacing w:before="0" w:after="40" w:line="240" w:lineRule="auto"/>
+        <w:jc w:val="both"/>
+        <w:rPr>
+          <w:rFonts w:ascii="Arial" w:hAnsi="Arial" w:eastAsia="Arial" w:cs="Arial"/>
+          <w:b w:val="0"/>
+          <w:bCs w:val="0"/>
+          <w:i w:val="0"/>
+          <w:iCs w:val="0"/>
+          <w:color w:val="203040"/>
+          <w:sz w:val="22"/>
+          <w:szCs w:val="22"/>
+          <w:lang w:val="en-US"/>
+        </w:rPr>
+      </w:pPr>
+    </w:p>
     <w:p xmlns:wp14="http://schemas.microsoft.com/office/word/2010/wordml" wp14:textId="77777777">
       <w:pPr>
         <w:spacing w:before="0" w:after="40" w:line="240" w:lineRule="auto"/>
@@ -2319,7 +2259,7 @@
         <w:drawing>
           <wp:inline>
             <wp:extent cx="5029200" cy="3333964"/>
-            <wp:docPr id="2033299070" name="Picture 2033299070"/>
+            <wp:docPr id="2033299072" name="Picture 2033299072"/>
             <wp:cNvGraphicFramePr>
               <a:graphicFrameLocks noChangeAspect="1"/>
             </wp:cNvGraphicFramePr>
@@ -2331,7 +2271,7 @@
                     <pic:cNvPicPr/>
                   </pic:nvPicPr>
                   <pic:blipFill>
-                    <a:blip r:embed="rId7"/>
+                    <a:blip r:embed="rId15"/>
                     <a:stretch>
                       <a:fillRect/>
                     </a:stretch>
@@ -2351,9 +2291,6 @@
       </w:r>
     </w:p>
     <w:p>
-      <w:pPr>
-        <w:pStyle w:val="Caption"/>
-      </w:pPr>
       <w:r>
         <w:rPr>
           <w:i/>
@@ -2427,8 +2364,8 @@
     <w:tbl>
       <w:tblPr>
         <w:tblStyle w:val="TableGrid"/>
-        <w:tblW w:type="auto" w:w="0"/>
-        <w:tblLook w:firstColumn="1" w:firstRow="1" w:lastColumn="0" w:lastRow="0" w:noHBand="0" w:noVBand="1" w:val="04A0"/>
+        <w:tblW w:w="0" w:type="auto"/>
+        <w:tblLook w:val="04A0" w:firstRow="1" w:lastRow="0" w:firstColumn="1" w:lastColumn="0" w:noHBand="0" w:noVBand="1"/>
       </w:tblPr>
       <w:tblGrid>
         <w:gridCol w:w="1762"/>
@@ -2438,17 +2375,20 @@
         <w:gridCol w:w="1762"/>
         <w:gridCol w:w="1762"/>
       </w:tblGrid>
-      <w:tr>
+      <w:tr xmlns:wp14="http://schemas.microsoft.com/office/word/2010/wordml" wp14:textId="77777777">
         <w:tc>
           <w:tcPr>
-            <w:tcW w:type="dxa" w:w="1762"/>
+            <w:tcW w:w="1762" w:type="dxa"/>
+            <w:tcMar/>
           </w:tcPr>
-          <w:p>
-            <w:r/>
-            <w:r>
-              <w:rPr>
-                <w:b/>
+          <w:p wp14:textId="77777777">
+            <w:r>
+              <w:rPr>
+                <w:b w:val="1"/>
+                <w:bCs w:val="1"/>
                 <w:sz w:val="18"/>
+                <w:szCs w:val="18"/>
+                <w:lang w:val="en-US"/>
               </w:rPr>
               <w:t>Variante</w:t>
             </w:r>
@@ -2456,14 +2396,17 @@
         </w:tc>
         <w:tc>
           <w:tcPr>
-            <w:tcW w:type="dxa" w:w="1762"/>
+            <w:tcW w:w="1762" w:type="dxa"/>
+            <w:tcMar/>
           </w:tcPr>
-          <w:p>
-            <w:r/>
-            <w:r>
-              <w:rPr>
-                <w:b/>
+          <w:p wp14:textId="77777777">
+            <w:r>
+              <w:rPr>
+                <w:b w:val="1"/>
+                <w:bCs w:val="1"/>
                 <w:sz w:val="18"/>
+                <w:szCs w:val="18"/>
+                <w:lang w:val="en-US"/>
               </w:rPr>
               <w:t>Predictoras</w:t>
             </w:r>
@@ -2471,9 +2414,10 @@
         </w:tc>
         <w:tc>
           <w:tcPr>
-            <w:tcW w:type="dxa" w:w="1762"/>
+            <w:tcW w:w="1762" w:type="dxa"/>
+            <w:tcMar/>
           </w:tcPr>
-          <w:p>
+          <w:p wp14:textId="77777777">
             <w:r/>
             <w:r>
               <w:rPr>
@@ -2486,9 +2430,10 @@
         </w:tc>
         <w:tc>
           <w:tcPr>
-            <w:tcW w:type="dxa" w:w="1762"/>
+            <w:tcW w:w="1762" w:type="dxa"/>
+            <w:tcMar/>
           </w:tcPr>
-          <w:p>
+          <w:p wp14:textId="77777777">
             <w:r/>
             <w:r>
               <w:rPr>
@@ -2501,14 +2446,17 @@
         </w:tc>
         <w:tc>
           <w:tcPr>
-            <w:tcW w:type="dxa" w:w="1762"/>
+            <w:tcW w:w="1762" w:type="dxa"/>
+            <w:tcMar/>
           </w:tcPr>
-          <w:p>
-            <w:r/>
-            <w:r>
-              <w:rPr>
-                <w:b/>
+          <w:p wp14:textId="77777777">
+            <w:r>
+              <w:rPr>
+                <w:b w:val="1"/>
+                <w:bCs w:val="1"/>
                 <w:sz w:val="18"/>
+                <w:szCs w:val="18"/>
+                <w:lang w:val="en-US"/>
               </w:rPr>
               <w:t>Brotes / Falsas</w:t>
             </w:r>
@@ -2516,30 +2464,35 @@
         </w:tc>
         <w:tc>
           <w:tcPr>
-            <w:tcW w:type="dxa" w:w="1762"/>
+            <w:tcW w:w="1762" w:type="dxa"/>
+            <w:tcMar/>
           </w:tcPr>
-          <w:p>
-            <w:r/>
-            <w:r>
-              <w:rPr>
-                <w:b/>
+          <w:p wp14:textId="77777777">
+            <w:r>
+              <w:rPr>
+                <w:b w:val="1"/>
+                <w:bCs w:val="1"/>
                 <w:sz w:val="18"/>
+                <w:szCs w:val="18"/>
+                <w:lang w:val="en-US"/>
               </w:rPr>
               <w:t>Inicios</w:t>
             </w:r>
           </w:p>
         </w:tc>
       </w:tr>
-      <w:tr>
+      <w:tr xmlns:wp14="http://schemas.microsoft.com/office/word/2010/wordml" wp14:textId="77777777">
         <w:tc>
           <w:tcPr>
-            <w:tcW w:type="dxa" w:w="1762"/>
+            <w:tcW w:w="1762" w:type="dxa"/>
+            <w:tcMar/>
           </w:tcPr>
-          <w:p>
-            <w:r/>
+          <w:p wp14:textId="77777777">
             <w:r>
               <w:rPr>
                 <w:sz w:val="18"/>
+                <w:szCs w:val="18"/>
+                <w:lang w:val="en-US"/>
               </w:rPr>
               <w:t>Champion completo</w:t>
             </w:r>
@@ -2547,9 +2500,10 @@
         </w:tc>
         <w:tc>
           <w:tcPr>
-            <w:tcW w:type="dxa" w:w="1762"/>
+            <w:tcW w:w="1762" w:type="dxa"/>
+            <w:tcMar/>
           </w:tcPr>
-          <w:p>
+          <w:p wp14:textId="77777777">
             <w:r/>
             <w:r>
               <w:rPr>
@@ -2561,9 +2515,10 @@
         </w:tc>
         <w:tc>
           <w:tcPr>
-            <w:tcW w:type="dxa" w:w="1762"/>
+            <w:tcW w:w="1762" w:type="dxa"/>
+            <w:tcMar/>
           </w:tcPr>
-          <w:p>
+          <w:p wp14:textId="77777777">
             <w:r/>
             <w:r>
               <w:rPr>
@@ -2575,9 +2530,10 @@
         </w:tc>
         <w:tc>
           <w:tcPr>
-            <w:tcW w:type="dxa" w:w="1762"/>
+            <w:tcW w:w="1762" w:type="dxa"/>
+            <w:tcMar/>
           </w:tcPr>
-          <w:p>
+          <w:p wp14:textId="77777777">
             <w:r/>
             <w:r>
               <w:rPr>
@@ -2589,9 +2545,10 @@
         </w:tc>
         <w:tc>
           <w:tcPr>
-            <w:tcW w:type="dxa" w:w="1762"/>
+            <w:tcW w:w="1762" w:type="dxa"/>
+            <w:tcMar/>
           </w:tcPr>
-          <w:p>
+          <w:p wp14:textId="77777777">
             <w:r/>
             <w:r>
               <w:rPr>
@@ -2603,9 +2560,10 @@
         </w:tc>
         <w:tc>
           <w:tcPr>
-            <w:tcW w:type="dxa" w:w="1762"/>
+            <w:tcW w:w="1762" w:type="dxa"/>
+            <w:tcMar/>
           </w:tcPr>
-          <w:p>
+          <w:p wp14:textId="77777777">
             <w:r/>
             <w:r>
               <w:rPr>
@@ -2616,16 +2574,18 @@
           </w:p>
         </w:tc>
       </w:tr>
-      <w:tr>
+      <w:tr xmlns:wp14="http://schemas.microsoft.com/office/word/2010/wordml" wp14:textId="77777777">
         <w:tc>
           <w:tcPr>
-            <w:tcW w:type="dxa" w:w="1762"/>
+            <w:tcW w:w="1762" w:type="dxa"/>
+            <w:tcMar/>
           </w:tcPr>
-          <w:p>
-            <w:r/>
+          <w:p wp14:textId="77777777">
             <w:r>
               <w:rPr>
                 <w:sz w:val="18"/>
+                <w:szCs w:val="18"/>
+                <w:lang w:val="en-US"/>
               </w:rPr>
               <w:t>Sin brote y brote_lag_1</w:t>
             </w:r>
@@ -2633,9 +2593,10 @@
         </w:tc>
         <w:tc>
           <w:tcPr>
-            <w:tcW w:type="dxa" w:w="1762"/>
+            <w:tcW w:w="1762" w:type="dxa"/>
+            <w:tcMar/>
           </w:tcPr>
-          <w:p>
+          <w:p wp14:textId="77777777">
             <w:r/>
             <w:r>
               <w:rPr>
@@ -2647,9 +2608,10 @@
         </w:tc>
         <w:tc>
           <w:tcPr>
-            <w:tcW w:type="dxa" w:w="1762"/>
+            <w:tcW w:w="1762" w:type="dxa"/>
+            <w:tcMar/>
           </w:tcPr>
-          <w:p>
+          <w:p wp14:textId="77777777">
             <w:r/>
             <w:r>
               <w:rPr>
@@ -2661,9 +2623,10 @@
         </w:tc>
         <w:tc>
           <w:tcPr>
-            <w:tcW w:type="dxa" w:w="1762"/>
+            <w:tcW w:w="1762" w:type="dxa"/>
+            <w:tcMar/>
           </w:tcPr>
-          <w:p>
+          <w:p wp14:textId="77777777">
             <w:r/>
             <w:r>
               <w:rPr>
@@ -2675,9 +2638,10 @@
         </w:tc>
         <w:tc>
           <w:tcPr>
-            <w:tcW w:type="dxa" w:w="1762"/>
+            <w:tcW w:w="1762" w:type="dxa"/>
+            <w:tcMar/>
           </w:tcPr>
-          <w:p>
+          <w:p wp14:textId="77777777">
             <w:r/>
             <w:r>
               <w:rPr>
@@ -2689,9 +2653,10 @@
         </w:tc>
         <w:tc>
           <w:tcPr>
-            <w:tcW w:type="dxa" w:w="1762"/>
+            <w:tcW w:w="1762" w:type="dxa"/>
+            <w:tcMar/>
           </w:tcPr>
-          <w:p>
+          <w:p wp14:textId="77777777">
             <w:r/>
             <w:r>
               <w:rPr>
@@ -2702,16 +2667,18 @@
           </w:p>
         </w:tc>
       </w:tr>
-      <w:tr>
+      <w:tr xmlns:wp14="http://schemas.microsoft.com/office/word/2010/wordml" wp14:textId="77777777">
         <w:tc>
           <w:tcPr>
-            <w:tcW w:type="dxa" w:w="1762"/>
+            <w:tcW w:w="1762" w:type="dxa"/>
+            <w:tcMar/>
           </w:tcPr>
-          <w:p>
-            <w:r/>
+          <w:p wp14:textId="77777777">
             <w:r>
               <w:rPr>
                 <w:sz w:val="18"/>
+                <w:szCs w:val="18"/>
+                <w:lang w:val="en-US"/>
               </w:rPr>
               <w:t>Sin estado actual del canal (también zona_canal y sir)</w:t>
             </w:r>
@@ -2719,9 +2686,10 @@
         </w:tc>
         <w:tc>
           <w:tcPr>
-            <w:tcW w:type="dxa" w:w="1762"/>
+            <w:tcW w:w="1762" w:type="dxa"/>
+            <w:tcMar/>
           </w:tcPr>
-          <w:p>
+          <w:p wp14:textId="77777777">
             <w:r/>
             <w:r>
               <w:rPr>
@@ -2733,9 +2701,10 @@
         </w:tc>
         <w:tc>
           <w:tcPr>
-            <w:tcW w:type="dxa" w:w="1762"/>
+            <w:tcW w:w="1762" w:type="dxa"/>
+            <w:tcMar/>
           </w:tcPr>
-          <w:p>
+          <w:p wp14:textId="77777777">
             <w:r/>
             <w:r>
               <w:rPr>
@@ -2747,9 +2716,10 @@
         </w:tc>
         <w:tc>
           <w:tcPr>
-            <w:tcW w:type="dxa" w:w="1762"/>
+            <w:tcW w:w="1762" w:type="dxa"/>
+            <w:tcMar/>
           </w:tcPr>
-          <w:p>
+          <w:p wp14:textId="77777777">
             <w:r/>
             <w:r>
               <w:rPr>
@@ -2761,9 +2731,10 @@
         </w:tc>
         <w:tc>
           <w:tcPr>
-            <w:tcW w:type="dxa" w:w="1762"/>
+            <w:tcW w:w="1762" w:type="dxa"/>
+            <w:tcMar/>
           </w:tcPr>
-          <w:p>
+          <w:p wp14:textId="77777777">
             <w:r/>
             <w:r>
               <w:rPr>
@@ -2775,9 +2746,10 @@
         </w:tc>
         <w:tc>
           <w:tcPr>
-            <w:tcW w:type="dxa" w:w="1762"/>
+            <w:tcW w:w="1762" w:type="dxa"/>
+            <w:tcMar/>
           </w:tcPr>
-          <w:p>
+          <w:p wp14:textId="77777777">
             <w:r/>
             <w:r>
               <w:rPr>
@@ -2788,16 +2760,18 @@
           </w:p>
         </w:tc>
       </w:tr>
-      <w:tr>
+      <w:tr xmlns:wp14="http://schemas.microsoft.com/office/word/2010/wordml" wp14:textId="77777777">
         <w:tc>
           <w:tcPr>
-            <w:tcW w:type="dxa" w:w="1762"/>
+            <w:tcW w:w="1762" w:type="dxa"/>
+            <w:tcMar/>
           </w:tcPr>
-          <w:p>
-            <w:r/>
+          <w:p wp14:textId="77777777">
             <w:r>
               <w:rPr>
                 <w:sz w:val="18"/>
+                <w:szCs w:val="18"/>
+                <w:lang w:val="en-US"/>
               </w:rPr>
               <w:t>Sin ninguna variable del canal (también percentiles y endemicidad)</w:t>
             </w:r>
@@ -2805,9 +2779,10 @@
         </w:tc>
         <w:tc>
           <w:tcPr>
-            <w:tcW w:type="dxa" w:w="1762"/>
+            <w:tcW w:w="1762" w:type="dxa"/>
+            <w:tcMar/>
           </w:tcPr>
-          <w:p>
+          <w:p wp14:textId="77777777">
             <w:r/>
             <w:r>
               <w:rPr>
@@ -2819,9 +2794,10 @@
         </w:tc>
         <w:tc>
           <w:tcPr>
-            <w:tcW w:type="dxa" w:w="1762"/>
+            <w:tcW w:w="1762" w:type="dxa"/>
+            <w:tcMar/>
           </w:tcPr>
-          <w:p>
+          <w:p wp14:textId="77777777">
             <w:r/>
             <w:r>
               <w:rPr>
@@ -2833,9 +2809,10 @@
         </w:tc>
         <w:tc>
           <w:tcPr>
-            <w:tcW w:type="dxa" w:w="1762"/>
+            <w:tcW w:w="1762" w:type="dxa"/>
+            <w:tcMar/>
           </w:tcPr>
-          <w:p>
+          <w:p wp14:textId="77777777">
             <w:r/>
             <w:r>
               <w:rPr>
@@ -2847,9 +2824,10 @@
         </w:tc>
         <w:tc>
           <w:tcPr>
-            <w:tcW w:type="dxa" w:w="1762"/>
+            <w:tcW w:w="1762" w:type="dxa"/>
+            <w:tcMar/>
           </w:tcPr>
-          <w:p>
+          <w:p wp14:textId="77777777">
             <w:r/>
             <w:r>
               <w:rPr>
@@ -2861,9 +2839,10 @@
         </w:tc>
         <w:tc>
           <w:tcPr>
-            <w:tcW w:type="dxa" w:w="1762"/>
+            <w:tcW w:w="1762" w:type="dxa"/>
+            <w:tcMar/>
           </w:tcPr>
-          <w:p>
+          <w:p wp14:textId="77777777">
             <w:r/>
             <w:r>
               <w:rPr>
@@ -2874,16 +2853,18 @@
           </w:p>
         </w:tc>
       </w:tr>
-      <w:tr>
+      <w:tr xmlns:wp14="http://schemas.microsoft.com/office/word/2010/wordml" wp14:textId="77777777">
         <w:tc>
           <w:tcPr>
-            <w:tcW w:type="dxa" w:w="1762"/>
+            <w:tcW w:w="1762" w:type="dxa"/>
+            <w:tcMar/>
           </w:tcPr>
-          <w:p>
-            <w:r/>
+          <w:p wp14:textId="77777777">
             <w:r>
               <w:rPr>
                 <w:sz w:val="18"/>
+                <w:szCs w:val="18"/>
+                <w:lang w:val="en-US"/>
               </w:rPr>
               <w:t>Sin variables climáticas</w:t>
             </w:r>
@@ -2891,9 +2872,10 @@
         </w:tc>
         <w:tc>
           <w:tcPr>
-            <w:tcW w:type="dxa" w:w="1762"/>
+            <w:tcW w:w="1762" w:type="dxa"/>
+            <w:tcMar/>
           </w:tcPr>
-          <w:p>
+          <w:p wp14:textId="77777777">
             <w:r/>
             <w:r>
               <w:rPr>
@@ -2905,9 +2887,10 @@
         </w:tc>
         <w:tc>
           <w:tcPr>
-            <w:tcW w:type="dxa" w:w="1762"/>
+            <w:tcW w:w="1762" w:type="dxa"/>
+            <w:tcMar/>
           </w:tcPr>
-          <w:p>
+          <w:p wp14:textId="77777777">
             <w:r/>
             <w:r>
               <w:rPr>
@@ -2919,9 +2902,10 @@
         </w:tc>
         <w:tc>
           <w:tcPr>
-            <w:tcW w:type="dxa" w:w="1762"/>
+            <w:tcW w:w="1762" w:type="dxa"/>
+            <w:tcMar/>
           </w:tcPr>
-          <w:p>
+          <w:p wp14:textId="77777777">
             <w:r/>
             <w:r>
               <w:rPr>
@@ -2933,9 +2917,10 @@
         </w:tc>
         <w:tc>
           <w:tcPr>
-            <w:tcW w:type="dxa" w:w="1762"/>
+            <w:tcW w:w="1762" w:type="dxa"/>
+            <w:tcMar/>
           </w:tcPr>
-          <w:p>
+          <w:p wp14:textId="77777777">
             <w:r/>
             <w:r>
               <w:rPr>
@@ -2947,9 +2932,10 @@
         </w:tc>
         <w:tc>
           <w:tcPr>
-            <w:tcW w:type="dxa" w:w="1762"/>
+            <w:tcW w:w="1762" w:type="dxa"/>
+            <w:tcMar/>
           </w:tcPr>
-          <w:p>
+          <w:p wp14:textId="77777777">
             <w:r/>
             <w:r>
               <w:rPr>
@@ -2961,6 +2947,21 @@
         </w:tc>
       </w:tr>
     </w:tbl>
+    <w:p>
+      <w:pPr>
+        <w:spacing w:before="0" w:after="20" w:line="240" w:lineRule="auto"/>
+        <w:jc w:val="both"/>
+        <w:rPr>
+          <w:rFonts w:ascii="Arial" w:hAnsi="Arial" w:eastAsia="Arial" w:cs="Arial"/>
+          <w:b w:val="0"/>
+          <w:bCs w:val="0"/>
+          <w:color w:val="203040"/>
+          <w:sz w:val="22"/>
+          <w:szCs w:val="22"/>
+          <w:lang w:val="en-US"/>
+        </w:rPr>
+      </w:pPr>
+    </w:p>
     <w:p>
       <w:pPr>
         <w:spacing w:before="0" w:after="20" w:line="240" w:lineRule="auto"/>
@@ -2987,7 +2988,631 @@
           <w:szCs w:val="22"/>
           <w:lang w:val="en-US"/>
         </w:rPr>
-        <w:t xml:space="preserve">La lectura del experimento deja tres conclusiones. La primera es que retirar brote y brote_lag_1 no cambia ninguna métrica: la información que aportan es redundante con el resto de variables del canal, de modo que la importancia alta que se observó para brote_lag_1 no implica dependencia del modelo respecto de esa columna en particular.</w:t>
+        <w:t xml:space="preserve">La </w:t>
+      </w:r>
+      <w:r>
+        <w:rPr>
+          <w:rFonts w:ascii="Arial" w:hAnsi="Arial" w:eastAsia="Arial" w:cs="Arial"/>
+          <w:b w:val="0"/>
+          <w:bCs w:val="0"/>
+          <w:color w:val="203040"/>
+          <w:sz w:val="22"/>
+          <w:szCs w:val="22"/>
+          <w:lang w:val="en-US"/>
+        </w:rPr>
+        <w:t>lectura</w:t>
+      </w:r>
+      <w:r>
+        <w:rPr>
+          <w:rFonts w:ascii="Arial" w:hAnsi="Arial" w:eastAsia="Arial" w:cs="Arial"/>
+          <w:b w:val="0"/>
+          <w:bCs w:val="0"/>
+          <w:color w:val="203040"/>
+          <w:sz w:val="22"/>
+          <w:szCs w:val="22"/>
+          <w:lang w:val="en-US"/>
+        </w:rPr>
+        <w:t xml:space="preserve"> del </w:t>
+      </w:r>
+      <w:r>
+        <w:rPr>
+          <w:rFonts w:ascii="Arial" w:hAnsi="Arial" w:eastAsia="Arial" w:cs="Arial"/>
+          <w:b w:val="0"/>
+          <w:bCs w:val="0"/>
+          <w:color w:val="203040"/>
+          <w:sz w:val="22"/>
+          <w:szCs w:val="22"/>
+          <w:lang w:val="en-US"/>
+        </w:rPr>
+        <w:t>experimento</w:t>
+      </w:r>
+      <w:r>
+        <w:rPr>
+          <w:rFonts w:ascii="Arial" w:hAnsi="Arial" w:eastAsia="Arial" w:cs="Arial"/>
+          <w:b w:val="0"/>
+          <w:bCs w:val="0"/>
+          <w:color w:val="203040"/>
+          <w:sz w:val="22"/>
+          <w:szCs w:val="22"/>
+          <w:lang w:val="en-US"/>
+        </w:rPr>
+        <w:t xml:space="preserve"> </w:t>
+      </w:r>
+      <w:r>
+        <w:rPr>
+          <w:rFonts w:ascii="Arial" w:hAnsi="Arial" w:eastAsia="Arial" w:cs="Arial"/>
+          <w:b w:val="0"/>
+          <w:bCs w:val="0"/>
+          <w:color w:val="203040"/>
+          <w:sz w:val="22"/>
+          <w:szCs w:val="22"/>
+          <w:lang w:val="en-US"/>
+        </w:rPr>
+        <w:t>deja</w:t>
+      </w:r>
+      <w:r>
+        <w:rPr>
+          <w:rFonts w:ascii="Arial" w:hAnsi="Arial" w:eastAsia="Arial" w:cs="Arial"/>
+          <w:b w:val="0"/>
+          <w:bCs w:val="0"/>
+          <w:color w:val="203040"/>
+          <w:sz w:val="22"/>
+          <w:szCs w:val="22"/>
+          <w:lang w:val="en-US"/>
+        </w:rPr>
+        <w:t xml:space="preserve"> </w:t>
+      </w:r>
+      <w:r>
+        <w:rPr>
+          <w:rFonts w:ascii="Arial" w:hAnsi="Arial" w:eastAsia="Arial" w:cs="Arial"/>
+          <w:b w:val="0"/>
+          <w:bCs w:val="0"/>
+          <w:color w:val="203040"/>
+          <w:sz w:val="22"/>
+          <w:szCs w:val="22"/>
+          <w:lang w:val="en-US"/>
+        </w:rPr>
+        <w:t>tres</w:t>
+      </w:r>
+      <w:r>
+        <w:rPr>
+          <w:rFonts w:ascii="Arial" w:hAnsi="Arial" w:eastAsia="Arial" w:cs="Arial"/>
+          <w:b w:val="0"/>
+          <w:bCs w:val="0"/>
+          <w:color w:val="203040"/>
+          <w:sz w:val="22"/>
+          <w:szCs w:val="22"/>
+          <w:lang w:val="en-US"/>
+        </w:rPr>
+        <w:t xml:space="preserve"> </w:t>
+      </w:r>
+      <w:r>
+        <w:rPr>
+          <w:rFonts w:ascii="Arial" w:hAnsi="Arial" w:eastAsia="Arial" w:cs="Arial"/>
+          <w:b w:val="0"/>
+          <w:bCs w:val="0"/>
+          <w:color w:val="203040"/>
+          <w:sz w:val="22"/>
+          <w:szCs w:val="22"/>
+          <w:lang w:val="en-US"/>
+        </w:rPr>
+        <w:t>conclusiones</w:t>
+      </w:r>
+      <w:r>
+        <w:rPr>
+          <w:rFonts w:ascii="Arial" w:hAnsi="Arial" w:eastAsia="Arial" w:cs="Arial"/>
+          <w:b w:val="0"/>
+          <w:bCs w:val="0"/>
+          <w:color w:val="203040"/>
+          <w:sz w:val="22"/>
+          <w:szCs w:val="22"/>
+          <w:lang w:val="en-US"/>
+        </w:rPr>
+        <w:t xml:space="preserve">. La </w:t>
+      </w:r>
+      <w:r>
+        <w:rPr>
+          <w:rFonts w:ascii="Arial" w:hAnsi="Arial" w:eastAsia="Arial" w:cs="Arial"/>
+          <w:b w:val="0"/>
+          <w:bCs w:val="0"/>
+          <w:color w:val="203040"/>
+          <w:sz w:val="22"/>
+          <w:szCs w:val="22"/>
+          <w:lang w:val="en-US"/>
+        </w:rPr>
+        <w:t>primera</w:t>
+      </w:r>
+      <w:r>
+        <w:rPr>
+          <w:rFonts w:ascii="Arial" w:hAnsi="Arial" w:eastAsia="Arial" w:cs="Arial"/>
+          <w:b w:val="0"/>
+          <w:bCs w:val="0"/>
+          <w:color w:val="203040"/>
+          <w:sz w:val="22"/>
+          <w:szCs w:val="22"/>
+          <w:lang w:val="en-US"/>
+        </w:rPr>
+        <w:t xml:space="preserve"> es </w:t>
+      </w:r>
+      <w:r>
+        <w:rPr>
+          <w:rFonts w:ascii="Arial" w:hAnsi="Arial" w:eastAsia="Arial" w:cs="Arial"/>
+          <w:b w:val="0"/>
+          <w:bCs w:val="0"/>
+          <w:color w:val="203040"/>
+          <w:sz w:val="22"/>
+          <w:szCs w:val="22"/>
+          <w:lang w:val="en-US"/>
+        </w:rPr>
+        <w:t>que</w:t>
+      </w:r>
+      <w:r>
+        <w:rPr>
+          <w:rFonts w:ascii="Arial" w:hAnsi="Arial" w:eastAsia="Arial" w:cs="Arial"/>
+          <w:b w:val="0"/>
+          <w:bCs w:val="0"/>
+          <w:color w:val="203040"/>
+          <w:sz w:val="22"/>
+          <w:szCs w:val="22"/>
+          <w:lang w:val="en-US"/>
+        </w:rPr>
+        <w:t xml:space="preserve"> </w:t>
+      </w:r>
+      <w:r>
+        <w:rPr>
+          <w:rFonts w:ascii="Arial" w:hAnsi="Arial" w:eastAsia="Arial" w:cs="Arial"/>
+          <w:b w:val="0"/>
+          <w:bCs w:val="0"/>
+          <w:color w:val="203040"/>
+          <w:sz w:val="22"/>
+          <w:szCs w:val="22"/>
+          <w:lang w:val="en-US"/>
+        </w:rPr>
+        <w:t>retirar</w:t>
+      </w:r>
+      <w:r>
+        <w:rPr>
+          <w:rFonts w:ascii="Arial" w:hAnsi="Arial" w:eastAsia="Arial" w:cs="Arial"/>
+          <w:b w:val="0"/>
+          <w:bCs w:val="0"/>
+          <w:color w:val="203040"/>
+          <w:sz w:val="22"/>
+          <w:szCs w:val="22"/>
+          <w:lang w:val="en-US"/>
+        </w:rPr>
+        <w:t xml:space="preserve"> </w:t>
+      </w:r>
+      <w:r>
+        <w:rPr>
+          <w:rFonts w:ascii="Arial" w:hAnsi="Arial" w:eastAsia="Arial" w:cs="Arial"/>
+          <w:b w:val="0"/>
+          <w:bCs w:val="0"/>
+          <w:color w:val="203040"/>
+          <w:sz w:val="22"/>
+          <w:szCs w:val="22"/>
+          <w:lang w:val="en-US"/>
+        </w:rPr>
+        <w:t>brote</w:t>
+      </w:r>
+      <w:r>
+        <w:rPr>
+          <w:rFonts w:ascii="Arial" w:hAnsi="Arial" w:eastAsia="Arial" w:cs="Arial"/>
+          <w:b w:val="0"/>
+          <w:bCs w:val="0"/>
+          <w:color w:val="203040"/>
+          <w:sz w:val="22"/>
+          <w:szCs w:val="22"/>
+          <w:lang w:val="en-US"/>
+        </w:rPr>
+        <w:t xml:space="preserve"> y brote_lag_1 no cambia </w:t>
+      </w:r>
+      <w:r>
+        <w:rPr>
+          <w:rFonts w:ascii="Arial" w:hAnsi="Arial" w:eastAsia="Arial" w:cs="Arial"/>
+          <w:b w:val="0"/>
+          <w:bCs w:val="0"/>
+          <w:color w:val="203040"/>
+          <w:sz w:val="22"/>
+          <w:szCs w:val="22"/>
+          <w:lang w:val="en-US"/>
+        </w:rPr>
+        <w:t>ninguna</w:t>
+      </w:r>
+      <w:r>
+        <w:rPr>
+          <w:rFonts w:ascii="Arial" w:hAnsi="Arial" w:eastAsia="Arial" w:cs="Arial"/>
+          <w:b w:val="0"/>
+          <w:bCs w:val="0"/>
+          <w:color w:val="203040"/>
+          <w:sz w:val="22"/>
+          <w:szCs w:val="22"/>
+          <w:lang w:val="en-US"/>
+        </w:rPr>
+        <w:t xml:space="preserve"> </w:t>
+      </w:r>
+      <w:r>
+        <w:rPr>
+          <w:rFonts w:ascii="Arial" w:hAnsi="Arial" w:eastAsia="Arial" w:cs="Arial"/>
+          <w:b w:val="0"/>
+          <w:bCs w:val="0"/>
+          <w:color w:val="203040"/>
+          <w:sz w:val="22"/>
+          <w:szCs w:val="22"/>
+          <w:lang w:val="en-US"/>
+        </w:rPr>
+        <w:t>métrica</w:t>
+      </w:r>
+      <w:r>
+        <w:rPr>
+          <w:rFonts w:ascii="Arial" w:hAnsi="Arial" w:eastAsia="Arial" w:cs="Arial"/>
+          <w:b w:val="0"/>
+          <w:bCs w:val="0"/>
+          <w:color w:val="203040"/>
+          <w:sz w:val="22"/>
+          <w:szCs w:val="22"/>
+          <w:lang w:val="en-US"/>
+        </w:rPr>
+        <w:t xml:space="preserve">: la </w:t>
+      </w:r>
+      <w:r>
+        <w:rPr>
+          <w:rFonts w:ascii="Arial" w:hAnsi="Arial" w:eastAsia="Arial" w:cs="Arial"/>
+          <w:b w:val="0"/>
+          <w:bCs w:val="0"/>
+          <w:color w:val="203040"/>
+          <w:sz w:val="22"/>
+          <w:szCs w:val="22"/>
+          <w:lang w:val="en-US"/>
+        </w:rPr>
+        <w:t>información</w:t>
+      </w:r>
+      <w:r>
+        <w:rPr>
+          <w:rFonts w:ascii="Arial" w:hAnsi="Arial" w:eastAsia="Arial" w:cs="Arial"/>
+          <w:b w:val="0"/>
+          <w:bCs w:val="0"/>
+          <w:color w:val="203040"/>
+          <w:sz w:val="22"/>
+          <w:szCs w:val="22"/>
+          <w:lang w:val="en-US"/>
+        </w:rPr>
+        <w:t xml:space="preserve"> </w:t>
+      </w:r>
+      <w:r>
+        <w:rPr>
+          <w:rFonts w:ascii="Arial" w:hAnsi="Arial" w:eastAsia="Arial" w:cs="Arial"/>
+          <w:b w:val="0"/>
+          <w:bCs w:val="0"/>
+          <w:color w:val="203040"/>
+          <w:sz w:val="22"/>
+          <w:szCs w:val="22"/>
+          <w:lang w:val="en-US"/>
+        </w:rPr>
+        <w:t>que</w:t>
+      </w:r>
+      <w:r>
+        <w:rPr>
+          <w:rFonts w:ascii="Arial" w:hAnsi="Arial" w:eastAsia="Arial" w:cs="Arial"/>
+          <w:b w:val="0"/>
+          <w:bCs w:val="0"/>
+          <w:color w:val="203040"/>
+          <w:sz w:val="22"/>
+          <w:szCs w:val="22"/>
+          <w:lang w:val="en-US"/>
+        </w:rPr>
+        <w:t xml:space="preserve"> </w:t>
+      </w:r>
+      <w:r>
+        <w:rPr>
+          <w:rFonts w:ascii="Arial" w:hAnsi="Arial" w:eastAsia="Arial" w:cs="Arial"/>
+          <w:b w:val="0"/>
+          <w:bCs w:val="0"/>
+          <w:color w:val="203040"/>
+          <w:sz w:val="22"/>
+          <w:szCs w:val="22"/>
+          <w:lang w:val="en-US"/>
+        </w:rPr>
+        <w:t>aportan</w:t>
+      </w:r>
+      <w:r>
+        <w:rPr>
+          <w:rFonts w:ascii="Arial" w:hAnsi="Arial" w:eastAsia="Arial" w:cs="Arial"/>
+          <w:b w:val="0"/>
+          <w:bCs w:val="0"/>
+          <w:color w:val="203040"/>
+          <w:sz w:val="22"/>
+          <w:szCs w:val="22"/>
+          <w:lang w:val="en-US"/>
+        </w:rPr>
+        <w:t xml:space="preserve"> es </w:t>
+      </w:r>
+      <w:r>
+        <w:rPr>
+          <w:rFonts w:ascii="Arial" w:hAnsi="Arial" w:eastAsia="Arial" w:cs="Arial"/>
+          <w:b w:val="0"/>
+          <w:bCs w:val="0"/>
+          <w:color w:val="203040"/>
+          <w:sz w:val="22"/>
+          <w:szCs w:val="22"/>
+          <w:lang w:val="en-US"/>
+        </w:rPr>
+        <w:t>redundante</w:t>
+      </w:r>
+      <w:r>
+        <w:rPr>
+          <w:rFonts w:ascii="Arial" w:hAnsi="Arial" w:eastAsia="Arial" w:cs="Arial"/>
+          <w:b w:val="0"/>
+          <w:bCs w:val="0"/>
+          <w:color w:val="203040"/>
+          <w:sz w:val="22"/>
+          <w:szCs w:val="22"/>
+          <w:lang w:val="en-US"/>
+        </w:rPr>
+        <w:t xml:space="preserve"> con el resto de variables del canal, de modo </w:t>
+      </w:r>
+      <w:r>
+        <w:rPr>
+          <w:rFonts w:ascii="Arial" w:hAnsi="Arial" w:eastAsia="Arial" w:cs="Arial"/>
+          <w:b w:val="0"/>
+          <w:bCs w:val="0"/>
+          <w:color w:val="203040"/>
+          <w:sz w:val="22"/>
+          <w:szCs w:val="22"/>
+          <w:lang w:val="en-US"/>
+        </w:rPr>
+        <w:t>que</w:t>
+      </w:r>
+      <w:r>
+        <w:rPr>
+          <w:rFonts w:ascii="Arial" w:hAnsi="Arial" w:eastAsia="Arial" w:cs="Arial"/>
+          <w:b w:val="0"/>
+          <w:bCs w:val="0"/>
+          <w:color w:val="203040"/>
+          <w:sz w:val="22"/>
+          <w:szCs w:val="22"/>
+          <w:lang w:val="en-US"/>
+        </w:rPr>
+        <w:t xml:space="preserve"> la </w:t>
+      </w:r>
+      <w:r>
+        <w:rPr>
+          <w:rFonts w:ascii="Arial" w:hAnsi="Arial" w:eastAsia="Arial" w:cs="Arial"/>
+          <w:b w:val="0"/>
+          <w:bCs w:val="0"/>
+          <w:color w:val="203040"/>
+          <w:sz w:val="22"/>
+          <w:szCs w:val="22"/>
+          <w:lang w:val="en-US"/>
+        </w:rPr>
+        <w:t>importancia</w:t>
+      </w:r>
+      <w:r>
+        <w:rPr>
+          <w:rFonts w:ascii="Arial" w:hAnsi="Arial" w:eastAsia="Arial" w:cs="Arial"/>
+          <w:b w:val="0"/>
+          <w:bCs w:val="0"/>
+          <w:color w:val="203040"/>
+          <w:sz w:val="22"/>
+          <w:szCs w:val="22"/>
+          <w:lang w:val="en-US"/>
+        </w:rPr>
+        <w:t xml:space="preserve"> </w:t>
+      </w:r>
+      <w:r>
+        <w:rPr>
+          <w:rFonts w:ascii="Arial" w:hAnsi="Arial" w:eastAsia="Arial" w:cs="Arial"/>
+          <w:b w:val="0"/>
+          <w:bCs w:val="0"/>
+          <w:color w:val="203040"/>
+          <w:sz w:val="22"/>
+          <w:szCs w:val="22"/>
+          <w:lang w:val="en-US"/>
+        </w:rPr>
+        <w:t>alta</w:t>
+      </w:r>
+      <w:r>
+        <w:rPr>
+          <w:rFonts w:ascii="Arial" w:hAnsi="Arial" w:eastAsia="Arial" w:cs="Arial"/>
+          <w:b w:val="0"/>
+          <w:bCs w:val="0"/>
+          <w:color w:val="203040"/>
+          <w:sz w:val="22"/>
+          <w:szCs w:val="22"/>
+          <w:lang w:val="en-US"/>
+        </w:rPr>
+        <w:t xml:space="preserve"> </w:t>
+      </w:r>
+      <w:r>
+        <w:rPr>
+          <w:rFonts w:ascii="Arial" w:hAnsi="Arial" w:eastAsia="Arial" w:cs="Arial"/>
+          <w:b w:val="0"/>
+          <w:bCs w:val="0"/>
+          <w:color w:val="203040"/>
+          <w:sz w:val="22"/>
+          <w:szCs w:val="22"/>
+          <w:lang w:val="en-US"/>
+        </w:rPr>
+        <w:t>que</w:t>
+      </w:r>
+      <w:r>
+        <w:rPr>
+          <w:rFonts w:ascii="Arial" w:hAnsi="Arial" w:eastAsia="Arial" w:cs="Arial"/>
+          <w:b w:val="0"/>
+          <w:bCs w:val="0"/>
+          <w:color w:val="203040"/>
+          <w:sz w:val="22"/>
+          <w:szCs w:val="22"/>
+          <w:lang w:val="en-US"/>
+        </w:rPr>
+        <w:t xml:space="preserve"> se </w:t>
+      </w:r>
+      <w:r>
+        <w:rPr>
+          <w:rFonts w:ascii="Arial" w:hAnsi="Arial" w:eastAsia="Arial" w:cs="Arial"/>
+          <w:b w:val="0"/>
+          <w:bCs w:val="0"/>
+          <w:color w:val="203040"/>
+          <w:sz w:val="22"/>
+          <w:szCs w:val="22"/>
+          <w:lang w:val="en-US"/>
+        </w:rPr>
+        <w:t>observó</w:t>
+      </w:r>
+      <w:r>
+        <w:rPr>
+          <w:rFonts w:ascii="Arial" w:hAnsi="Arial" w:eastAsia="Arial" w:cs="Arial"/>
+          <w:b w:val="0"/>
+          <w:bCs w:val="0"/>
+          <w:color w:val="203040"/>
+          <w:sz w:val="22"/>
+          <w:szCs w:val="22"/>
+          <w:lang w:val="en-US"/>
+        </w:rPr>
+        <w:t xml:space="preserve"> para brote_lag_1 no </w:t>
+      </w:r>
+      <w:r>
+        <w:rPr>
+          <w:rFonts w:ascii="Arial" w:hAnsi="Arial" w:eastAsia="Arial" w:cs="Arial"/>
+          <w:b w:val="0"/>
+          <w:bCs w:val="0"/>
+          <w:color w:val="203040"/>
+          <w:sz w:val="22"/>
+          <w:szCs w:val="22"/>
+          <w:lang w:val="en-US"/>
+        </w:rPr>
+        <w:t>implica</w:t>
+      </w:r>
+      <w:r>
+        <w:rPr>
+          <w:rFonts w:ascii="Arial" w:hAnsi="Arial" w:eastAsia="Arial" w:cs="Arial"/>
+          <w:b w:val="0"/>
+          <w:bCs w:val="0"/>
+          <w:color w:val="203040"/>
+          <w:sz w:val="22"/>
+          <w:szCs w:val="22"/>
+          <w:lang w:val="en-US"/>
+        </w:rPr>
+        <w:t xml:space="preserve"> </w:t>
+      </w:r>
+      <w:r>
+        <w:rPr>
+          <w:rFonts w:ascii="Arial" w:hAnsi="Arial" w:eastAsia="Arial" w:cs="Arial"/>
+          <w:b w:val="0"/>
+          <w:bCs w:val="0"/>
+          <w:color w:val="203040"/>
+          <w:sz w:val="22"/>
+          <w:szCs w:val="22"/>
+          <w:lang w:val="en-US"/>
+        </w:rPr>
+        <w:t>dependencia</w:t>
+      </w:r>
+      <w:r>
+        <w:rPr>
+          <w:rFonts w:ascii="Arial" w:hAnsi="Arial" w:eastAsia="Arial" w:cs="Arial"/>
+          <w:b w:val="0"/>
+          <w:bCs w:val="0"/>
+          <w:color w:val="203040"/>
+          <w:sz w:val="22"/>
+          <w:szCs w:val="22"/>
+          <w:lang w:val="en-US"/>
+        </w:rPr>
+        <w:t xml:space="preserve"> del </w:t>
+      </w:r>
+      <w:r>
+        <w:rPr>
+          <w:rFonts w:ascii="Arial" w:hAnsi="Arial" w:eastAsia="Arial" w:cs="Arial"/>
+          <w:b w:val="0"/>
+          <w:bCs w:val="0"/>
+          <w:color w:val="203040"/>
+          <w:sz w:val="22"/>
+          <w:szCs w:val="22"/>
+          <w:lang w:val="en-US"/>
+        </w:rPr>
+        <w:t>modelo</w:t>
+      </w:r>
+      <w:r>
+        <w:rPr>
+          <w:rFonts w:ascii="Arial" w:hAnsi="Arial" w:eastAsia="Arial" w:cs="Arial"/>
+          <w:b w:val="0"/>
+          <w:bCs w:val="0"/>
+          <w:color w:val="203040"/>
+          <w:sz w:val="22"/>
+          <w:szCs w:val="22"/>
+          <w:lang w:val="en-US"/>
+        </w:rPr>
+        <w:t xml:space="preserve"> </w:t>
+      </w:r>
+      <w:r>
+        <w:rPr>
+          <w:rFonts w:ascii="Arial" w:hAnsi="Arial" w:eastAsia="Arial" w:cs="Arial"/>
+          <w:b w:val="0"/>
+          <w:bCs w:val="0"/>
+          <w:color w:val="203040"/>
+          <w:sz w:val="22"/>
+          <w:szCs w:val="22"/>
+          <w:lang w:val="en-US"/>
+        </w:rPr>
+        <w:t>respecto</w:t>
+      </w:r>
+      <w:r>
+        <w:rPr>
+          <w:rFonts w:ascii="Arial" w:hAnsi="Arial" w:eastAsia="Arial" w:cs="Arial"/>
+          <w:b w:val="0"/>
+          <w:bCs w:val="0"/>
+          <w:color w:val="203040"/>
+          <w:sz w:val="22"/>
+          <w:szCs w:val="22"/>
+          <w:lang w:val="en-US"/>
+        </w:rPr>
+        <w:t xml:space="preserve"> de </w:t>
+      </w:r>
+      <w:r>
+        <w:rPr>
+          <w:rFonts w:ascii="Arial" w:hAnsi="Arial" w:eastAsia="Arial" w:cs="Arial"/>
+          <w:b w:val="0"/>
+          <w:bCs w:val="0"/>
+          <w:color w:val="203040"/>
+          <w:sz w:val="22"/>
+          <w:szCs w:val="22"/>
+          <w:lang w:val="en-US"/>
+        </w:rPr>
+        <w:t>esa</w:t>
+      </w:r>
+      <w:r>
+        <w:rPr>
+          <w:rFonts w:ascii="Arial" w:hAnsi="Arial" w:eastAsia="Arial" w:cs="Arial"/>
+          <w:b w:val="0"/>
+          <w:bCs w:val="0"/>
+          <w:color w:val="203040"/>
+          <w:sz w:val="22"/>
+          <w:szCs w:val="22"/>
+          <w:lang w:val="en-US"/>
+        </w:rPr>
+        <w:t xml:space="preserve"> columna </w:t>
+      </w:r>
+      <w:r>
+        <w:rPr>
+          <w:rFonts w:ascii="Arial" w:hAnsi="Arial" w:eastAsia="Arial" w:cs="Arial"/>
+          <w:b w:val="0"/>
+          <w:bCs w:val="0"/>
+          <w:color w:val="203040"/>
+          <w:sz w:val="22"/>
+          <w:szCs w:val="22"/>
+          <w:lang w:val="en-US"/>
+        </w:rPr>
+        <w:t>en</w:t>
+      </w:r>
+      <w:r>
+        <w:rPr>
+          <w:rFonts w:ascii="Arial" w:hAnsi="Arial" w:eastAsia="Arial" w:cs="Arial"/>
+          <w:b w:val="0"/>
+          <w:bCs w:val="0"/>
+          <w:color w:val="203040"/>
+          <w:sz w:val="22"/>
+          <w:szCs w:val="22"/>
+          <w:lang w:val="en-US"/>
+        </w:rPr>
+        <w:t xml:space="preserve"> particular.</w:t>
       </w:r>
     </w:p>
     <w:p>
@@ -4954,9 +5579,6 @@
       </w:r>
     </w:p>
     <w:p>
-      <w:pPr>
-        <w:pStyle w:val="Caption"/>
-      </w:pPr>
       <w:r>
         <w:rPr>
           <w:i/>
@@ -4980,7 +5602,7 @@
         <w:drawing>
           <wp:inline>
             <wp:extent cx="5029200" cy="2235200"/>
-            <wp:docPr id="2033299072" name="Picture 2033299072"/>
+            <wp:docPr id="2033299070" name="Picture 2033299070"/>
             <wp:cNvGraphicFramePr>
               <a:graphicFrameLocks noChangeAspect="1"/>
             </wp:cNvGraphicFramePr>
@@ -4992,7 +5614,7 @@
                     <pic:cNvPicPr/>
                   </pic:nvPicPr>
                   <pic:blipFill>
-                    <a:blip r:embed="rId15"/>
+                    <a:blip r:embed="rId7"/>
                     <a:stretch>
                       <a:fillRect/>
                     </a:stretch>
@@ -5012,9 +5634,6 @@
       </w:r>
     </w:p>
     <w:p>
-      <w:pPr>
-        <w:pStyle w:val="Caption"/>
-      </w:pPr>
       <w:r>
         <w:rPr>
           <w:i/>
@@ -8494,7 +9113,6 @@
                 <w:color w:val="203040"/>
                 <w:sz w:val="22"/>
                 <w:szCs w:val="22"/>
-                <w:rtl w:val="0"/>
               </w:rPr>
               <w:t xml:space="preserve">Todos</w:t>
             </w:r>
@@ -8569,11 +9187,6 @@
                 <w:szCs w:val="22"/>
               </w:rPr>
             </w:pPr>
-            <w:r>
-              <w:rPr>
-                <w:rtl w:val="0"/>
-              </w:rPr>
-            </w:r>
           </w:p>
         </w:tc>
       </w:tr>
@@ -8637,7 +9250,6 @@
                 <w:color w:val="203040"/>
                 <w:sz w:val="22"/>
                 <w:szCs w:val="22"/>
-                <w:rtl w:val="0"/>
               </w:rPr>
               <w:t xml:space="preserve">Sergio Ballesteros.</w:t>
             </w:r>
@@ -8784,11 +9396,6 @@
                 <w:szCs w:val="22"/>
               </w:rPr>
             </w:pPr>
-            <w:r>
-              <w:rPr>
-                <w:rtl w:val="0"/>
-              </w:rPr>
-            </w:r>
           </w:p>
         </w:tc>
       </w:tr>
@@ -8865,7 +9472,6 @@
                 <w:color w:val="203040"/>
                 <w:sz w:val="22"/>
                 <w:szCs w:val="22"/>
-                <w:rtl w:val="0"/>
               </w:rPr>
               <w:t xml:space="preserve">Nicolas Lara y Stevan Ramirez</w:t>
             </w:r>
@@ -8948,7 +9554,6 @@
                 <w:color w:val="203040"/>
                 <w:sz w:val="22"/>
                 <w:szCs w:val="22"/>
-                <w:rtl w:val="0"/>
               </w:rPr>
               <w:t xml:space="preserve">Mauricio Rodriguez</w:t>
             </w:r>
@@ -9105,7 +9710,6 @@
                 <w:color w:val="203040"/>
                 <w:sz w:val="22"/>
                 <w:szCs w:val="22"/>
-                <w:rtl w:val="0"/>
               </w:rPr>
               <w:t xml:space="preserve">Todos.</w:t>
             </w:r>

</xml_diff>

<commit_message>
docs: agregar diagrama de arquitectura e insertarlo en reporte
- tutorial/sat_dengue_arquitectura.drawio — fuente editable draw.io
- tutorial/sat_dengue_arquitectura.png — imagen para el reporte
- Insertado en reporte (placeholder p75): arquitectura en producción
</commit_message>
<xml_diff>
--- a/tutorial/Reporte_Entrega3_final-2.docx
+++ b/tutorial/Reporte_Entrega3_final-2.docx
@@ -5881,31 +5881,6 @@
           <w:lang w:val="en-US"/>
         </w:rPr>
       </w:pPr>
-      <w:r>
-        <w:rPr>
-          <w:rFonts w:ascii="Arial" w:hAnsi="Arial" w:eastAsia="Arial" w:cs="Arial"/>
-          <w:b w:val="0"/>
-          <w:bCs w:val="0"/>
-          <w:i w:val="1"/>
-          <w:iCs w:val="1"/>
-          <w:color w:val="5b677a"/>
-          <w:sz w:val="22"/>
-          <w:szCs w:val="22"/>
-          <w:lang w:val="en-US"/>
-        </w:rPr>
-        <w:t xml:space="preserve">[Imagen "Diagrama de arquitectura final de </w:t>
-      </w:r>
-      <w:r>
-        <w:rPr>
-          <w:i w:val="1"/>
-          <w:iCs w:val="1"/>
-          <w:color w:val="5b677a"/>
-          <w:sz w:val="22"/>
-          <w:szCs w:val="22"/>
-          <w:lang w:val="en-US"/>
-        </w:rPr>
-        <w:t xml:space="preserve">SAT_Dengue</w:t>
-      </w:r>
       <w:sdt>
         <w:sdtPr>
           <w:id w:val="1676541920"/>
@@ -5932,9 +5907,46 @@
         </w:sdtContent>
       </w:sdt>
       <w:r>
-        <w:rPr>
-          <w:rtl w:val="0"/>
-        </w:rPr>
+        <w:drawing>
+          <wp:inline>
+            <wp:extent cx="5029200" cy="2300177"/>
+            <wp:docPr id="2033299073" name="Picture 2033299073"/>
+            <wp:cNvGraphicFramePr>
+              <a:graphicFrameLocks noChangeAspect="1"/>
+            </wp:cNvGraphicFramePr>
+            <a:graphic>
+              <a:graphicData uri="http://schemas.openxmlformats.org/drawingml/2006/picture">
+                <pic:pic>
+                  <pic:nvPicPr>
+                    <pic:cNvPr id="0" name="sat_dengue_arquitectura.png"/>
+                    <pic:cNvPicPr/>
+                  </pic:nvPicPr>
+                  <pic:blipFill>
+                    <a:blip r:embed="rId16"/>
+                    <a:stretch>
+                      <a:fillRect/>
+                    </a:stretch>
+                  </pic:blipFill>
+                  <pic:spPr>
+                    <a:xfrm>
+                      <a:off x="0" y="0"/>
+                      <a:ext cx="5029200" cy="2300177"/>
+                    </a:xfrm>
+                    <a:prstGeom prst="rect"/>
+                  </pic:spPr>
+                </pic:pic>
+              </a:graphicData>
+            </a:graphic>
+          </wp:inline>
+        </w:drawing>
+      </w:r>
+    </w:p>
+    <w:p>
+      <w:r>
+        <w:rPr>
+          <w:i/>
+        </w:rPr>
+        <w:t>Figura: Arquitectura del sistema SAT-Dengue en producción</w:t>
       </w:r>
     </w:p>
     <w:p xmlns:wp14="http://schemas.microsoft.com/office/word/2010/wordml" wp14:textId="77777777">

</xml_diff>

<commit_message>
docs: reporte final con las 8 imágenes completas (versión Stevan 2)
Dashboard, Swagger, Docker, feature importance, ROC/PR,
inicios de brote, MLflow y diagrama de arquitectura.
</commit_message>
<xml_diff>
--- a/tutorial/Reporte_Entrega3_final-2.docx
+++ b/tutorial/Reporte_Entrega3_final-2.docx
@@ -2217,11 +2217,6 @@
       <w:pPr>
         <w:spacing w:before="0" w:after="20" w:line="240" w:lineRule="auto"/>
         <w:jc w:val="both"/>
-        <w:rPr>
-          <w:sz w:val="22"/>
-          <w:szCs w:val="22"/>
-          <w:lang w:val="en-US"/>
-        </w:rPr>
       </w:pPr>
       <w:r>
         <w:rPr>
@@ -2243,35 +2238,36 @@
         </w:rPr>
       </w:r>
     </w:p>
-    <w:p xmlns:wp14="http://schemas.microsoft.com/office/word/2010/wordml" wp14:textId="77777777">
-      <w:pPr>
-        <w:shd w:val="clear" w:color="auto" w:fill="F5F8FC"/>
-        <w:spacing w:before="30" w:after="40" w:line="240" w:lineRule="auto"/>
-        <w:ind w:left="216" w:right="216" w:firstLine="0"/>
+    <w:p>
+      <w:pPr>
+        <w:pStyle w:val="Normal"/>
+        <w:spacing w:before="0" w:after="20" w:line="240" w:lineRule="auto"/>
         <w:jc w:val="both"/>
-        <w:rPr>
-          <w:sz w:val="22"/>
-          <w:szCs w:val="22"/>
-          <w:lang w:val="en-US"/>
-        </w:rPr>
       </w:pPr>
       <w:r>
         <w:drawing>
-          <wp:inline>
-            <wp:extent cx="5029200" cy="3333964"/>
-            <wp:docPr id="2033299072" name="Picture 2033299072"/>
+          <wp:inline wp14:editId="7906AD2C" wp14:anchorId="75C5F903">
+            <wp:extent cx="5029200" cy="3333750"/>
+            <wp:effectExtent l="0" t="0" r="0" b="0"/>
+            <wp:docPr id="1012222271" name="drawing"/>
             <wp:cNvGraphicFramePr>
               <a:graphicFrameLocks noChangeAspect="1"/>
             </wp:cNvGraphicFramePr>
             <a:graphic>
-              <a:graphicData uri="http://schemas.openxmlformats.org/drawingml/2006/picture">
-                <pic:pic>
+              <a:graphicData xmlns:a="http://schemas.openxmlformats.org/drawingml/2006/main" uri="http://schemas.openxmlformats.org/drawingml/2006/picture">
+                <pic:pic xmlns:pic="http://schemas.openxmlformats.org/drawingml/2006/picture">
                   <pic:nvPicPr>
-                    <pic:cNvPr id="0" name="report_feature_importance.png"/>
+                    <pic:cNvPr id="1012222271" name="Picture 1012222271"/>
                     <pic:cNvPicPr/>
                   </pic:nvPicPr>
                   <pic:blipFill>
-                    <a:blip r:embed="rId15"/>
+                    <a:blip xmlns:r="http://schemas.openxmlformats.org/officeDocument/2006/relationships" r:embed="rId878384324">
+                      <a:extLst>
+                        <a:ext uri="{28A0092B-C50C-407E-A947-70E740481C1C}">
+                          <a14:useLocalDpi xmlns:a14="http://schemas.microsoft.com/office/drawing/2010/main"/>
+                        </a:ext>
+                      </a:extLst>
+                    </a:blip>
                     <a:stretch>
                       <a:fillRect/>
                     </a:stretch>
@@ -2279,9 +2275,11 @@
                   <pic:spPr>
                     <a:xfrm>
                       <a:off x="0" y="0"/>
-                      <a:ext cx="5029200" cy="3333964"/>
+                      <a:ext cx="5029200" cy="3333750"/>
                     </a:xfrm>
-                    <a:prstGeom prst="rect"/>
+                    <a:prstGeom prst="rect">
+                      <a:avLst/>
+                    </a:prstGeom>
                   </pic:spPr>
                 </pic:pic>
               </a:graphicData>
@@ -2290,12 +2288,36 @@
         </w:drawing>
       </w:r>
     </w:p>
-    <w:p>
+    <w:p xmlns:wp14="http://schemas.microsoft.com/office/word/2010/wordml" wp14:textId="77777777">
+      <w:pPr>
+        <w:shd w:val="clear" w:color="auto" w:fill="F5F8FC"/>
+        <w:spacing w:before="30" w:after="40" w:line="240" w:lineRule="auto"/>
+        <w:ind w:left="216" w:right="216" w:firstLine="0"/>
+        <w:jc w:val="both"/>
+        <w:rPr>
+          <w:sz w:val="22"/>
+          <w:szCs w:val="22"/>
+          <w:lang w:val="en-US"/>
+        </w:rPr>
+      </w:pPr>
       <w:r>
         <w:rPr>
-          <w:i/>
-        </w:rPr>
-        <w:t>Figura: Importancia de características — XGBoost Champion (conjunto de prueba)</w:t>
+          <w:rFonts w:ascii="Arial" w:hAnsi="Arial" w:eastAsia="Arial" w:cs="Arial"/>
+          <w:b w:val="0"/>
+          <w:bCs w:val="0"/>
+          <w:i w:val="1"/>
+          <w:iCs w:val="1"/>
+          <w:color w:val="5b677a"/>
+          <w:sz w:val="22"/>
+          <w:szCs w:val="22"/>
+          <w:lang w:val="en-US"/>
+        </w:rPr>
+        <w:t xml:space="preserve">[Imagen "Importancia de características del Champion vigente, regenerada después del reentrenamiento; resaltar brote_lag_1, SIR y variables del canal endémico"]</w:t>
+      </w:r>
+      <w:r>
+        <w:rPr>
+          <w:rtl w:val="0"/>
+        </w:rPr>
       </w:r>
     </w:p>
     <w:p xmlns:wp14="http://schemas.microsoft.com/office/word/2010/wordml" wp14:textId="77777777">
@@ -2975,7 +2997,7 @@
           <w:color w:val="203040"/>
           <w:sz w:val="22"/>
           <w:szCs w:val="22"/>
-          <w:lang w:val="en-US"/>
+          <w:lang w:val="es-ES"/>
         </w:rPr>
       </w:pPr>
       <w:r>
@@ -2986,7 +3008,7 @@
           <w:color w:val="203040"/>
           <w:sz w:val="22"/>
           <w:szCs w:val="22"/>
-          <w:lang w:val="en-US"/>
+          <w:lang w:val="es-ES"/>
         </w:rPr>
         <w:t xml:space="preserve">La </w:t>
       </w:r>
@@ -2998,7 +3020,7 @@
           <w:color w:val="203040"/>
           <w:sz w:val="22"/>
           <w:szCs w:val="22"/>
-          <w:lang w:val="en-US"/>
+          <w:lang w:val="es-ES"/>
         </w:rPr>
         <w:t>lectura</w:t>
       </w:r>
@@ -3010,7 +3032,7 @@
           <w:color w:val="203040"/>
           <w:sz w:val="22"/>
           <w:szCs w:val="22"/>
-          <w:lang w:val="en-US"/>
+          <w:lang w:val="es-ES"/>
         </w:rPr>
         <w:t xml:space="preserve"> del </w:t>
       </w:r>
@@ -3022,7 +3044,7 @@
           <w:color w:val="203040"/>
           <w:sz w:val="22"/>
           <w:szCs w:val="22"/>
-          <w:lang w:val="en-US"/>
+          <w:lang w:val="es-ES"/>
         </w:rPr>
         <w:t>experimento</w:t>
       </w:r>
@@ -3034,7 +3056,7 @@
           <w:color w:val="203040"/>
           <w:sz w:val="22"/>
           <w:szCs w:val="22"/>
-          <w:lang w:val="en-US"/>
+          <w:lang w:val="es-ES"/>
         </w:rPr>
         <w:t xml:space="preserve"> </w:t>
       </w:r>
@@ -3046,7 +3068,7 @@
           <w:color w:val="203040"/>
           <w:sz w:val="22"/>
           <w:szCs w:val="22"/>
-          <w:lang w:val="en-US"/>
+          <w:lang w:val="es-ES"/>
         </w:rPr>
         <w:t>deja</w:t>
       </w:r>
@@ -3058,7 +3080,7 @@
           <w:color w:val="203040"/>
           <w:sz w:val="22"/>
           <w:szCs w:val="22"/>
-          <w:lang w:val="en-US"/>
+          <w:lang w:val="es-ES"/>
         </w:rPr>
         <w:t xml:space="preserve"> </w:t>
       </w:r>
@@ -3070,7 +3092,7 @@
           <w:color w:val="203040"/>
           <w:sz w:val="22"/>
           <w:szCs w:val="22"/>
-          <w:lang w:val="en-US"/>
+          <w:lang w:val="es-ES"/>
         </w:rPr>
         <w:t>tres</w:t>
       </w:r>
@@ -3082,7 +3104,7 @@
           <w:color w:val="203040"/>
           <w:sz w:val="22"/>
           <w:szCs w:val="22"/>
-          <w:lang w:val="en-US"/>
+          <w:lang w:val="es-ES"/>
         </w:rPr>
         <w:t xml:space="preserve"> </w:t>
       </w:r>
@@ -3094,7 +3116,7 @@
           <w:color w:val="203040"/>
           <w:sz w:val="22"/>
           <w:szCs w:val="22"/>
-          <w:lang w:val="en-US"/>
+          <w:lang w:val="es-ES"/>
         </w:rPr>
         <w:t>conclusiones</w:t>
       </w:r>
@@ -3106,7 +3128,7 @@
           <w:color w:val="203040"/>
           <w:sz w:val="22"/>
           <w:szCs w:val="22"/>
-          <w:lang w:val="en-US"/>
+          <w:lang w:val="es-ES"/>
         </w:rPr>
         <w:t xml:space="preserve">. La </w:t>
       </w:r>
@@ -3118,7 +3140,7 @@
           <w:color w:val="203040"/>
           <w:sz w:val="22"/>
           <w:szCs w:val="22"/>
-          <w:lang w:val="en-US"/>
+          <w:lang w:val="es-ES"/>
         </w:rPr>
         <w:t>primera</w:t>
       </w:r>
@@ -3130,7 +3152,7 @@
           <w:color w:val="203040"/>
           <w:sz w:val="22"/>
           <w:szCs w:val="22"/>
-          <w:lang w:val="en-US"/>
+          <w:lang w:val="es-ES"/>
         </w:rPr>
         <w:t xml:space="preserve"> es </w:t>
       </w:r>
@@ -3142,7 +3164,7 @@
           <w:color w:val="203040"/>
           <w:sz w:val="22"/>
           <w:szCs w:val="22"/>
-          <w:lang w:val="en-US"/>
+          <w:lang w:val="es-ES"/>
         </w:rPr>
         <w:t>que</w:t>
       </w:r>
@@ -3154,7 +3176,7 @@
           <w:color w:val="203040"/>
           <w:sz w:val="22"/>
           <w:szCs w:val="22"/>
-          <w:lang w:val="en-US"/>
+          <w:lang w:val="es-ES"/>
         </w:rPr>
         <w:t xml:space="preserve"> </w:t>
       </w:r>
@@ -3166,7 +3188,7 @@
           <w:color w:val="203040"/>
           <w:sz w:val="22"/>
           <w:szCs w:val="22"/>
-          <w:lang w:val="en-US"/>
+          <w:lang w:val="es-ES"/>
         </w:rPr>
         <w:t>retirar</w:t>
       </w:r>
@@ -3178,7 +3200,7 @@
           <w:color w:val="203040"/>
           <w:sz w:val="22"/>
           <w:szCs w:val="22"/>
-          <w:lang w:val="en-US"/>
+          <w:lang w:val="es-ES"/>
         </w:rPr>
         <w:t xml:space="preserve"> </w:t>
       </w:r>
@@ -3190,7 +3212,7 @@
           <w:color w:val="203040"/>
           <w:sz w:val="22"/>
           <w:szCs w:val="22"/>
-          <w:lang w:val="en-US"/>
+          <w:lang w:val="es-ES"/>
         </w:rPr>
         <w:t>brote</w:t>
       </w:r>
@@ -3202,7 +3224,7 @@
           <w:color w:val="203040"/>
           <w:sz w:val="22"/>
           <w:szCs w:val="22"/>
-          <w:lang w:val="en-US"/>
+          <w:lang w:val="es-ES"/>
         </w:rPr>
         <w:t xml:space="preserve"> y brote_lag_1 no cambia </w:t>
       </w:r>
@@ -3214,7 +3236,7 @@
           <w:color w:val="203040"/>
           <w:sz w:val="22"/>
           <w:szCs w:val="22"/>
-          <w:lang w:val="en-US"/>
+          <w:lang w:val="es-ES"/>
         </w:rPr>
         <w:t>ninguna</w:t>
       </w:r>
@@ -3226,7 +3248,7 @@
           <w:color w:val="203040"/>
           <w:sz w:val="22"/>
           <w:szCs w:val="22"/>
-          <w:lang w:val="en-US"/>
+          <w:lang w:val="es-ES"/>
         </w:rPr>
         <w:t xml:space="preserve"> </w:t>
       </w:r>
@@ -3238,7 +3260,7 @@
           <w:color w:val="203040"/>
           <w:sz w:val="22"/>
           <w:szCs w:val="22"/>
-          <w:lang w:val="en-US"/>
+          <w:lang w:val="es-ES"/>
         </w:rPr>
         <w:t>métrica</w:t>
       </w:r>
@@ -3250,7 +3272,7 @@
           <w:color w:val="203040"/>
           <w:sz w:val="22"/>
           <w:szCs w:val="22"/>
-          <w:lang w:val="en-US"/>
+          <w:lang w:val="es-ES"/>
         </w:rPr>
         <w:t xml:space="preserve">: la </w:t>
       </w:r>
@@ -3262,7 +3284,7 @@
           <w:color w:val="203040"/>
           <w:sz w:val="22"/>
           <w:szCs w:val="22"/>
-          <w:lang w:val="en-US"/>
+          <w:lang w:val="es-ES"/>
         </w:rPr>
         <w:t>información</w:t>
       </w:r>
@@ -3274,7 +3296,7 @@
           <w:color w:val="203040"/>
           <w:sz w:val="22"/>
           <w:szCs w:val="22"/>
-          <w:lang w:val="en-US"/>
+          <w:lang w:val="es-ES"/>
         </w:rPr>
         <w:t xml:space="preserve"> </w:t>
       </w:r>
@@ -3286,7 +3308,7 @@
           <w:color w:val="203040"/>
           <w:sz w:val="22"/>
           <w:szCs w:val="22"/>
-          <w:lang w:val="en-US"/>
+          <w:lang w:val="es-ES"/>
         </w:rPr>
         <w:t>que</w:t>
       </w:r>
@@ -3298,7 +3320,7 @@
           <w:color w:val="203040"/>
           <w:sz w:val="22"/>
           <w:szCs w:val="22"/>
-          <w:lang w:val="en-US"/>
+          <w:lang w:val="es-ES"/>
         </w:rPr>
         <w:t xml:space="preserve"> </w:t>
       </w:r>
@@ -3310,7 +3332,7 @@
           <w:color w:val="203040"/>
           <w:sz w:val="22"/>
           <w:szCs w:val="22"/>
-          <w:lang w:val="en-US"/>
+          <w:lang w:val="es-ES"/>
         </w:rPr>
         <w:t>aportan</w:t>
       </w:r>
@@ -3322,7 +3344,7 @@
           <w:color w:val="203040"/>
           <w:sz w:val="22"/>
           <w:szCs w:val="22"/>
-          <w:lang w:val="en-US"/>
+          <w:lang w:val="es-ES"/>
         </w:rPr>
         <w:t xml:space="preserve"> es </w:t>
       </w:r>
@@ -3334,7 +3356,7 @@
           <w:color w:val="203040"/>
           <w:sz w:val="22"/>
           <w:szCs w:val="22"/>
-          <w:lang w:val="en-US"/>
+          <w:lang w:val="es-ES"/>
         </w:rPr>
         <w:t>redundante</w:t>
       </w:r>
@@ -3346,7 +3368,7 @@
           <w:color w:val="203040"/>
           <w:sz w:val="22"/>
           <w:szCs w:val="22"/>
-          <w:lang w:val="en-US"/>
+          <w:lang w:val="es-ES"/>
         </w:rPr>
         <w:t xml:space="preserve"> con el resto de variables del canal, de modo </w:t>
       </w:r>
@@ -3358,7 +3380,7 @@
           <w:color w:val="203040"/>
           <w:sz w:val="22"/>
           <w:szCs w:val="22"/>
-          <w:lang w:val="en-US"/>
+          <w:lang w:val="es-ES"/>
         </w:rPr>
         <w:t>que</w:t>
       </w:r>
@@ -3370,7 +3392,7 @@
           <w:color w:val="203040"/>
           <w:sz w:val="22"/>
           <w:szCs w:val="22"/>
-          <w:lang w:val="en-US"/>
+          <w:lang w:val="es-ES"/>
         </w:rPr>
         <w:t xml:space="preserve"> la </w:t>
       </w:r>
@@ -3382,7 +3404,7 @@
           <w:color w:val="203040"/>
           <w:sz w:val="22"/>
           <w:szCs w:val="22"/>
-          <w:lang w:val="en-US"/>
+          <w:lang w:val="es-ES"/>
         </w:rPr>
         <w:t>importancia</w:t>
       </w:r>
@@ -3394,7 +3416,7 @@
           <w:color w:val="203040"/>
           <w:sz w:val="22"/>
           <w:szCs w:val="22"/>
-          <w:lang w:val="en-US"/>
+          <w:lang w:val="es-ES"/>
         </w:rPr>
         <w:t xml:space="preserve"> </w:t>
       </w:r>
@@ -3406,7 +3428,7 @@
           <w:color w:val="203040"/>
           <w:sz w:val="22"/>
           <w:szCs w:val="22"/>
-          <w:lang w:val="en-US"/>
+          <w:lang w:val="es-ES"/>
         </w:rPr>
         <w:t>alta</w:t>
       </w:r>
@@ -3418,7 +3440,7 @@
           <w:color w:val="203040"/>
           <w:sz w:val="22"/>
           <w:szCs w:val="22"/>
-          <w:lang w:val="en-US"/>
+          <w:lang w:val="es-ES"/>
         </w:rPr>
         <w:t xml:space="preserve"> </w:t>
       </w:r>
@@ -3430,7 +3452,7 @@
           <w:color w:val="203040"/>
           <w:sz w:val="22"/>
           <w:szCs w:val="22"/>
-          <w:lang w:val="en-US"/>
+          <w:lang w:val="es-ES"/>
         </w:rPr>
         <w:t>que</w:t>
       </w:r>
@@ -3442,7 +3464,7 @@
           <w:color w:val="203040"/>
           <w:sz w:val="22"/>
           <w:szCs w:val="22"/>
-          <w:lang w:val="en-US"/>
+          <w:lang w:val="es-ES"/>
         </w:rPr>
         <w:t xml:space="preserve"> se </w:t>
       </w:r>
@@ -3454,7 +3476,7 @@
           <w:color w:val="203040"/>
           <w:sz w:val="22"/>
           <w:szCs w:val="22"/>
-          <w:lang w:val="en-US"/>
+          <w:lang w:val="es-ES"/>
         </w:rPr>
         <w:t>observó</w:t>
       </w:r>
@@ -3466,7 +3488,7 @@
           <w:color w:val="203040"/>
           <w:sz w:val="22"/>
           <w:szCs w:val="22"/>
-          <w:lang w:val="en-US"/>
+          <w:lang w:val="es-ES"/>
         </w:rPr>
         <w:t xml:space="preserve"> para brote_lag_1 no </w:t>
       </w:r>
@@ -3478,7 +3500,7 @@
           <w:color w:val="203040"/>
           <w:sz w:val="22"/>
           <w:szCs w:val="22"/>
-          <w:lang w:val="en-US"/>
+          <w:lang w:val="es-ES"/>
         </w:rPr>
         <w:t>implica</w:t>
       </w:r>
@@ -3490,7 +3512,7 @@
           <w:color w:val="203040"/>
           <w:sz w:val="22"/>
           <w:szCs w:val="22"/>
-          <w:lang w:val="en-US"/>
+          <w:lang w:val="es-ES"/>
         </w:rPr>
         <w:t xml:space="preserve"> </w:t>
       </w:r>
@@ -3502,7 +3524,7 @@
           <w:color w:val="203040"/>
           <w:sz w:val="22"/>
           <w:szCs w:val="22"/>
-          <w:lang w:val="en-US"/>
+          <w:lang w:val="es-ES"/>
         </w:rPr>
         <w:t>dependencia</w:t>
       </w:r>
@@ -3514,7 +3536,7 @@
           <w:color w:val="203040"/>
           <w:sz w:val="22"/>
           <w:szCs w:val="22"/>
-          <w:lang w:val="en-US"/>
+          <w:lang w:val="es-ES"/>
         </w:rPr>
         <w:t xml:space="preserve"> del </w:t>
       </w:r>
@@ -3526,7 +3548,7 @@
           <w:color w:val="203040"/>
           <w:sz w:val="22"/>
           <w:szCs w:val="22"/>
-          <w:lang w:val="en-US"/>
+          <w:lang w:val="es-ES"/>
         </w:rPr>
         <w:t>modelo</w:t>
       </w:r>
@@ -3538,7 +3560,7 @@
           <w:color w:val="203040"/>
           <w:sz w:val="22"/>
           <w:szCs w:val="22"/>
-          <w:lang w:val="en-US"/>
+          <w:lang w:val="es-ES"/>
         </w:rPr>
         <w:t xml:space="preserve"> </w:t>
       </w:r>
@@ -3550,7 +3572,7 @@
           <w:color w:val="203040"/>
           <w:sz w:val="22"/>
           <w:szCs w:val="22"/>
-          <w:lang w:val="en-US"/>
+          <w:lang w:val="es-ES"/>
         </w:rPr>
         <w:t>respecto</w:t>
       </w:r>
@@ -3562,7 +3584,7 @@
           <w:color w:val="203040"/>
           <w:sz w:val="22"/>
           <w:szCs w:val="22"/>
-          <w:lang w:val="en-US"/>
+          <w:lang w:val="es-ES"/>
         </w:rPr>
         <w:t xml:space="preserve"> de </w:t>
       </w:r>
@@ -3574,7 +3596,7 @@
           <w:color w:val="203040"/>
           <w:sz w:val="22"/>
           <w:szCs w:val="22"/>
-          <w:lang w:val="en-US"/>
+          <w:lang w:val="es-ES"/>
         </w:rPr>
         <w:t>esa</w:t>
       </w:r>
@@ -3586,7 +3608,7 @@
           <w:color w:val="203040"/>
           <w:sz w:val="22"/>
           <w:szCs w:val="22"/>
-          <w:lang w:val="en-US"/>
+          <w:lang w:val="es-ES"/>
         </w:rPr>
         <w:t xml:space="preserve"> columna </w:t>
       </w:r>
@@ -3598,7 +3620,7 @@
           <w:color w:val="203040"/>
           <w:sz w:val="22"/>
           <w:szCs w:val="22"/>
-          <w:lang w:val="en-US"/>
+          <w:lang w:val="es-ES"/>
         </w:rPr>
         <w:t>en</w:t>
       </w:r>
@@ -3610,7 +3632,7 @@
           <w:color w:val="203040"/>
           <w:sz w:val="22"/>
           <w:szCs w:val="22"/>
-          <w:lang w:val="en-US"/>
+          <w:lang w:val="es-ES"/>
         </w:rPr>
         <w:t xml:space="preserve"> particular.</w:t>
       </w:r>
@@ -5525,41 +5547,37 @@
           <w:szCs w:val="22"/>
         </w:rPr>
       </w:pPr>
-      <w:r>
-        <w:rPr>
-          <w:rtl w:val="0"/>
-        </w:rPr>
-      </w:r>
     </w:p>
-    <w:p xmlns:wp14="http://schemas.microsoft.com/office/word/2010/wordml" wp14:textId="77777777">
-      <w:pPr>
-        <w:shd w:val="clear" w:color="auto" w:fill="F5F8FC"/>
-        <w:spacing w:before="30" w:after="40" w:line="240" w:lineRule="auto"/>
-        <w:ind w:left="216" w:right="216" w:firstLine="0"/>
+    <w:p>
+      <w:pPr>
+        <w:pStyle w:val="Normal"/>
+        <w:spacing w:before="0" w:after="40" w:line="240" w:lineRule="auto"/>
         <w:jc w:val="both"/>
-        <w:rPr>
-          <w:sz w:val="22"/>
-          <w:szCs w:val="22"/>
-          <w:lang w:val="en-US"/>
-        </w:rPr>
       </w:pPr>
       <w:r>
         <w:drawing>
-          <wp:inline>
-            <wp:extent cx="5029200" cy="2049037"/>
-            <wp:docPr id="2033299071" name="Picture 2033299071"/>
+          <wp:inline wp14:editId="2CE56CF5" wp14:anchorId="44CE5996">
+            <wp:extent cx="5029200" cy="2047875"/>
+            <wp:effectExtent l="0" t="0" r="0" b="0"/>
+            <wp:docPr id="1688213696" name="drawing"/>
             <wp:cNvGraphicFramePr>
               <a:graphicFrameLocks noChangeAspect="1"/>
             </wp:cNvGraphicFramePr>
             <a:graphic>
-              <a:graphicData uri="http://schemas.openxmlformats.org/drawingml/2006/picture">
-                <pic:pic>
+              <a:graphicData xmlns:a="http://schemas.openxmlformats.org/drawingml/2006/main" uri="http://schemas.openxmlformats.org/drawingml/2006/picture">
+                <pic:pic xmlns:pic="http://schemas.openxmlformats.org/drawingml/2006/picture">
                   <pic:nvPicPr>
-                    <pic:cNvPr id="0" name="report_roc_pr.png"/>
+                    <pic:cNvPr id="1688213696" name="Picture 1688213696"/>
                     <pic:cNvPicPr/>
                   </pic:nvPicPr>
                   <pic:blipFill>
-                    <a:blip r:embed="rId14"/>
+                    <a:blip xmlns:r="http://schemas.openxmlformats.org/officeDocument/2006/relationships" r:embed="rId2835761">
+                      <a:extLst>
+                        <a:ext uri="{28A0092B-C50C-407E-A947-70E740481C1C}">
+                          <a14:useLocalDpi xmlns:a14="http://schemas.microsoft.com/office/drawing/2010/main"/>
+                        </a:ext>
+                      </a:extLst>
+                    </a:blip>
                     <a:stretch>
                       <a:fillRect/>
                     </a:stretch>
@@ -5567,9 +5585,503 @@
                   <pic:spPr>
                     <a:xfrm>
                       <a:off x="0" y="0"/>
-                      <a:ext cx="5029200" cy="2049037"/>
+                      <a:ext cx="5029200" cy="2047875"/>
                     </a:xfrm>
-                    <a:prstGeom prst="rect"/>
+                    <a:prstGeom prst="rect">
+                      <a:avLst/>
+                    </a:prstGeom>
+                  </pic:spPr>
+                </pic:pic>
+              </a:graphicData>
+            </a:graphic>
+          </wp:inline>
+        </w:drawing>
+      </w:r>
+    </w:p>
+    <w:p xmlns:wp14="http://schemas.microsoft.com/office/word/2010/wordml" wp14:textId="77777777">
+      <w:pPr>
+        <w:shd w:val="clear" w:color="auto" w:fill="F5F8FC"/>
+        <w:spacing w:before="30" w:after="40" w:line="240" w:lineRule="auto"/>
+        <w:ind w:left="216" w:right="216" w:firstLine="0"/>
+        <w:jc w:val="both"/>
+      </w:pPr>
+      <w:r>
+        <w:rPr>
+          <w:rFonts w:ascii="Arial" w:hAnsi="Arial" w:eastAsia="Arial" w:cs="Arial"/>
+          <w:b w:val="0"/>
+          <w:bCs w:val="0"/>
+          <w:i w:val="1"/>
+          <w:iCs w:val="1"/>
+          <w:color w:val="5b677a"/>
+          <w:sz w:val="22"/>
+          <w:szCs w:val="22"/>
+          <w:lang w:val="en-US"/>
+        </w:rPr>
+        <w:t xml:space="preserve">[Imagen "Curvas ROC y Precision-Recall regeneradas para las corridas comparables del conjunto de prueba"]</w:t>
+      </w:r>
+      <w:r>
+        <w:rPr>
+          <w:rtl w:val="0"/>
+        </w:rPr>
+      </w:r>
+    </w:p>
+    <w:p>
+      <w:pPr>
+        <w:shd w:val="clear" w:color="auto" w:fill="F5F8FC"/>
+        <w:spacing w:before="30" w:after="40" w:line="240" w:lineRule="auto"/>
+        <w:ind w:left="216" w:right="216" w:firstLine="0"/>
+        <w:jc w:val="both"/>
+        <w:rPr>
+          <w:rFonts w:ascii="Arial" w:hAnsi="Arial" w:eastAsia="Arial" w:cs="Arial"/>
+          <w:b w:val="0"/>
+          <w:bCs w:val="0"/>
+          <w:i w:val="1"/>
+          <w:iCs w:val="1"/>
+          <w:color w:val="5B677A"/>
+          <w:sz w:val="22"/>
+          <w:szCs w:val="22"/>
+          <w:lang w:val="en-US"/>
+        </w:rPr>
+      </w:pPr>
+    </w:p>
+    <w:p>
+      <w:pPr>
+        <w:pStyle w:val="Normal"/>
+        <w:shd w:val="clear" w:color="auto" w:fill="F5F8FC"/>
+        <w:spacing w:before="30" w:after="40" w:line="240" w:lineRule="auto"/>
+        <w:ind w:left="0" w:right="216" w:firstLine="0"/>
+        <w:jc w:val="both"/>
+      </w:pPr>
+      <w:r>
+        <w:drawing>
+          <wp:inline wp14:editId="6490DF22" wp14:anchorId="704FD2A2">
+            <wp:extent cx="5029200" cy="2228850"/>
+            <wp:effectExtent l="0" t="0" r="0" b="0"/>
+            <wp:docPr id="159704080" name="drawing"/>
+            <wp:cNvGraphicFramePr>
+              <a:graphicFrameLocks noChangeAspect="1"/>
+            </wp:cNvGraphicFramePr>
+            <a:graphic>
+              <a:graphicData xmlns:a="http://schemas.openxmlformats.org/drawingml/2006/main" uri="http://schemas.openxmlformats.org/drawingml/2006/picture">
+                <pic:pic xmlns:pic="http://schemas.openxmlformats.org/drawingml/2006/picture">
+                  <pic:nvPicPr>
+                    <pic:cNvPr id="159704080" name="Picture 159704080"/>
+                    <pic:cNvPicPr/>
+                  </pic:nvPicPr>
+                  <pic:blipFill>
+                    <a:blip xmlns:r="http://schemas.openxmlformats.org/officeDocument/2006/relationships" r:embed="rId1979040148">
+                      <a:extLst>
+                        <a:ext uri="{28A0092B-C50C-407E-A947-70E740481C1C}">
+                          <a14:useLocalDpi xmlns:a14="http://schemas.microsoft.com/office/drawing/2010/main"/>
+                        </a:ext>
+                      </a:extLst>
+                    </a:blip>
+                    <a:stretch>
+                      <a:fillRect/>
+                    </a:stretch>
+                  </pic:blipFill>
+                  <pic:spPr>
+                    <a:xfrm>
+                      <a:off x="0" y="0"/>
+                      <a:ext cx="5029200" cy="2228850"/>
+                    </a:xfrm>
+                    <a:prstGeom prst="rect">
+                      <a:avLst/>
+                    </a:prstGeom>
+                  </pic:spPr>
+                </pic:pic>
+              </a:graphicData>
+            </a:graphic>
+          </wp:inline>
+        </w:drawing>
+      </w:r>
+    </w:p>
+    <w:p xmlns:wp14="http://schemas.microsoft.com/office/word/2010/wordml" wp14:textId="77777777">
+      <w:pPr>
+        <w:shd w:val="clear" w:color="auto" w:fill="F5F8FC"/>
+        <w:spacing w:before="30" w:after="40" w:line="240" w:lineRule="auto"/>
+        <w:ind w:left="216" w:right="216" w:firstLine="0"/>
+        <w:jc w:val="both"/>
+        <w:rPr>
+          <w:sz w:val="22"/>
+          <w:szCs w:val="22"/>
+          <w:lang w:val="en-US"/>
+        </w:rPr>
+      </w:pPr>
+      <w:r>
+        <w:rPr>
+          <w:rFonts w:ascii="Arial" w:hAnsi="Arial" w:eastAsia="Arial" w:cs="Arial"/>
+          <w:b w:val="0"/>
+          <w:bCs w:val="0"/>
+          <w:i w:val="1"/>
+          <w:iCs w:val="1"/>
+          <w:color w:val="5b677a"/>
+          <w:sz w:val="22"/>
+          <w:szCs w:val="22"/>
+          <w:lang w:val="en-US"/>
+        </w:rPr>
+        <w:t xml:space="preserve">[Imagen "Comparación de inicios de brote detectados por XGBoost, LightGBM, canal endémico, persistencia, Poisson y GAM"]</w:t>
+      </w:r>
+      <w:r>
+        <w:rPr>
+          <w:rtl w:val="0"/>
+        </w:rPr>
+      </w:r>
+    </w:p>
+    <w:p xmlns:wp14="http://schemas.microsoft.com/office/word/2010/wordml" wp14:textId="77777777">
+      <w:pPr>
+        <w:pStyle w:val="Heading2"/>
+        <w:jc w:val="both"/>
+        <w:rPr>
+          <w:sz w:val="22"/>
+          <w:szCs w:val="22"/>
+        </w:rPr>
+      </w:pPr>
+      <w:r>
+        <w:rPr>
+          <w:rtl w:val="0"/>
+        </w:rPr>
+      </w:r>
+    </w:p>
+    <w:p xmlns:wp14="http://schemas.microsoft.com/office/word/2010/wordml" wp14:textId="77777777">
+      <w:pPr>
+        <w:pStyle w:val="Heading2"/>
+        <w:jc w:val="both"/>
+        <w:rPr>
+          <w:sz w:val="22"/>
+          <w:szCs w:val="22"/>
+          <w:lang w:val="en-US"/>
+        </w:rPr>
+      </w:pPr>
+      <w:r>
+        <w:rPr>
+          <w:sz w:val="22"/>
+          <w:szCs w:val="22"/>
+          <w:lang w:val="en-US"/>
+        </w:rPr>
+        <w:t>2.4 Gestión de experimentos con MLflow</w:t>
+      </w:r>
+    </w:p>
+    <w:p xmlns:wp14="http://schemas.microsoft.com/office/word/2010/wordml" wp14:textId="77777777">
+      <w:pPr>
+        <w:spacing w:before="0" w:after="40" w:line="240" w:lineRule="auto"/>
+        <w:jc w:val="both"/>
+      </w:pPr>
+      <w:r>
+        <w:rPr>
+          <w:rFonts w:ascii="Arial" w:hAnsi="Arial" w:eastAsia="Arial" w:cs="Arial"/>
+          <w:b w:val="0"/>
+          <w:bCs w:val="0"/>
+          <w:i w:val="0"/>
+          <w:iCs w:val="0"/>
+          <w:color w:val="203040"/>
+          <w:sz w:val="22"/>
+          <w:szCs w:val="22"/>
+          <w:lang w:val="en-US"/>
+        </w:rPr>
+        <w:t xml:space="preserve">Los experimentos vigentes se registran en MLflow bajo sat-dengue. Cada corrida conserva parámetros, horizonte, conjunto evaluado, métricas, umbral y artefactos. La convención de alcance separa las métricas de los dos municipios, las nacionales y las específicas por DIVIPOLA. Esta normalización evita comparar números calculados sobre universos diferentes y permite rastrear el modelo desplegado frente a sus corridas.</w:t>
+      </w:r>
+      <w:r>
+        <w:rPr>
+          <w:rtl w:val="0"/>
+        </w:rPr>
+      </w:r>
+    </w:p>
+    <w:p>
+      <w:pPr>
+        <w:spacing w:before="0" w:after="40" w:line="240" w:lineRule="auto"/>
+        <w:jc w:val="both"/>
+        <w:rPr>
+          <w:rFonts w:ascii="Arial" w:hAnsi="Arial" w:eastAsia="Arial" w:cs="Arial"/>
+          <w:b w:val="0"/>
+          <w:bCs w:val="0"/>
+          <w:i w:val="0"/>
+          <w:iCs w:val="0"/>
+          <w:color w:val="203040"/>
+          <w:sz w:val="22"/>
+          <w:szCs w:val="22"/>
+          <w:lang w:val="en-US"/>
+        </w:rPr>
+      </w:pPr>
+    </w:p>
+    <w:p>
+      <w:pPr>
+        <w:spacing w:before="0" w:after="40" w:line="240" w:lineRule="auto"/>
+        <w:jc w:val="both"/>
+        <w:rPr>
+          <w:rFonts w:ascii="Arial" w:hAnsi="Arial" w:eastAsia="Arial" w:cs="Arial"/>
+          <w:b w:val="0"/>
+          <w:bCs w:val="0"/>
+          <w:i w:val="0"/>
+          <w:iCs w:val="0"/>
+          <w:color w:val="203040"/>
+          <w:sz w:val="22"/>
+          <w:szCs w:val="22"/>
+          <w:lang w:val="en-US"/>
+        </w:rPr>
+      </w:pPr>
+      <w:r>
+        <w:drawing>
+          <wp:inline wp14:editId="4314405F" wp14:anchorId="6144C887">
+            <wp:extent cx="6724650" cy="2886075"/>
+            <wp:effectExtent l="0" t="0" r="0" b="0"/>
+            <wp:docPr id="1585446332" name="drawing"/>
+            <wp:cNvGraphicFramePr>
+              <a:graphicFrameLocks noChangeAspect="1"/>
+            </wp:cNvGraphicFramePr>
+            <a:graphic>
+              <a:graphicData xmlns:a="http://schemas.openxmlformats.org/drawingml/2006/main" uri="http://schemas.openxmlformats.org/drawingml/2006/picture">
+                <pic:pic xmlns:pic="http://schemas.openxmlformats.org/drawingml/2006/picture">
+                  <pic:nvPicPr>
+                    <pic:cNvPr id="1585446332" name="Picture 1585446332"/>
+                    <pic:cNvPicPr/>
+                  </pic:nvPicPr>
+                  <pic:blipFill>
+                    <a:blip xmlns:r="http://schemas.openxmlformats.org/officeDocument/2006/relationships" r:embed="rId637262926">
+                      <a:extLst>
+                        <a:ext uri="{28A0092B-C50C-407E-A947-70E740481C1C}">
+                          <a14:useLocalDpi xmlns:a14="http://schemas.microsoft.com/office/drawing/2010/main"/>
+                        </a:ext>
+                      </a:extLst>
+                    </a:blip>
+                    <a:stretch>
+                      <a:fillRect/>
+                    </a:stretch>
+                  </pic:blipFill>
+                  <pic:spPr>
+                    <a:xfrm>
+                      <a:off x="0" y="0"/>
+                      <a:ext cx="6724650" cy="2886075"/>
+                    </a:xfrm>
+                    <a:prstGeom prst="rect">
+                      <a:avLst/>
+                    </a:prstGeom>
+                  </pic:spPr>
+                </pic:pic>
+              </a:graphicData>
+            </a:graphic>
+          </wp:inline>
+        </w:drawing>
+      </w:r>
+    </w:p>
+    <w:p xmlns:wp14="http://schemas.microsoft.com/office/word/2010/wordml" wp14:textId="77777777">
+      <w:pPr>
+        <w:shd w:val="clear" w:color="auto" w:fill="F5F8FC"/>
+        <w:spacing w:before="30" w:after="40" w:line="240" w:lineRule="auto"/>
+        <w:ind w:left="216" w:right="216" w:firstLine="0"/>
+        <w:jc w:val="both"/>
+        <w:rPr>
+          <w:sz w:val="22"/>
+          <w:szCs w:val="22"/>
+          <w:lang w:val="en-US"/>
+        </w:rPr>
+      </w:pPr>
+      <w:r>
+        <w:rPr>
+          <w:rFonts w:ascii="Arial" w:hAnsi="Arial" w:eastAsia="Arial" w:cs="Arial"/>
+          <w:b w:val="0"/>
+          <w:bCs w:val="0"/>
+          <w:i w:val="1"/>
+          <w:iCs w:val="1"/>
+          <w:color w:val="5b677a"/>
+          <w:sz w:val="22"/>
+          <w:szCs w:val="22"/>
+          <w:lang w:val="en-US"/>
+        </w:rPr>
+        <w:t xml:space="preserve">[Imagen "Vista de MLflow filtrada por params.conjunto = prueba, mostrando corridas T+1/T+2 y métricas usadas en la comparación final"]</w:t>
+      </w:r>
+      <w:r>
+        <w:rPr>
+          <w:rtl w:val="0"/>
+        </w:rPr>
+      </w:r>
+    </w:p>
+    <w:p xmlns:wp14="http://schemas.microsoft.com/office/word/2010/wordml" wp14:textId="77777777">
+      <w:pPr>
+        <w:pStyle w:val="Heading2"/>
+        <w:jc w:val="both"/>
+        <w:rPr>
+          <w:sz w:val="22"/>
+          <w:szCs w:val="22"/>
+        </w:rPr>
+      </w:pPr>
+      <w:r>
+        <w:rPr>
+          <w:rtl w:val="0"/>
+        </w:rPr>
+      </w:r>
+    </w:p>
+    <w:p xmlns:wp14="http://schemas.microsoft.com/office/word/2010/wordml" wp14:textId="77777777">
+      <w:pPr>
+        <w:pStyle w:val="Heading2"/>
+        <w:jc w:val="both"/>
+        <w:rPr>
+          <w:sz w:val="22"/>
+          <w:szCs w:val="22"/>
+          <w:lang w:val="en-US"/>
+        </w:rPr>
+      </w:pPr>
+      <w:r>
+        <w:rPr>
+          <w:sz w:val="22"/>
+          <w:szCs w:val="22"/>
+          <w:lang w:val="en-US"/>
+        </w:rPr>
+        <w:t>2.5 Evaluación comparativa y selección del Champion</w:t>
+      </w:r>
+    </w:p>
+    <w:p xmlns:wp14="http://schemas.microsoft.com/office/word/2010/wordml" wp14:textId="77777777">
+      <w:pPr>
+        <w:spacing w:before="0" w:after="40" w:line="240" w:lineRule="auto"/>
+        <w:jc w:val="both"/>
+        <w:rPr>
+          <w:sz w:val="22"/>
+          <w:szCs w:val="22"/>
+          <w:lang w:val="en-US"/>
+        </w:rPr>
+      </w:pPr>
+      <w:r>
+        <w:rPr>
+          <w:rFonts w:ascii="Arial" w:hAnsi="Arial" w:eastAsia="Arial" w:cs="Arial"/>
+          <w:b w:val="0"/>
+          <w:bCs w:val="0"/>
+          <w:i w:val="0"/>
+          <w:iCs w:val="0"/>
+          <w:color w:val="203040"/>
+          <w:sz w:val="22"/>
+          <w:szCs w:val="22"/>
+          <w:lang w:val="en-US"/>
+        </w:rPr>
+        <w:t xml:space="preserve">XGBoost se mantiene como Champion desplegado porque es la alternativa integrada, calibrada y validada de extremo a extremo contra el contrato de 39 features. Esta elección es de integración y reproducibilidad del producto, no una afirmación de superioridad absoluta: en T+1 empata con LightGBM en F1 e inicios, y en T+2 LightGBM muestra mejor detección de inicios. La evidencia actual obliga a separar “mejor integrado” de “mejor predictor”.</w:t>
+      </w:r>
+      <w:r>
+        <w:rPr>
+          <w:rtl w:val="0"/>
+        </w:rPr>
+      </w:r>
+    </w:p>
+    <w:p xmlns:wp14="http://schemas.microsoft.com/office/word/2010/wordml" wp14:textId="77777777">
+      <w:pPr>
+        <w:pStyle w:val="Heading1"/>
+        <w:jc w:val="center"/>
+        <w:rPr>
+          <w:sz w:val="22"/>
+          <w:szCs w:val="22"/>
+          <w:lang w:val="en-US"/>
+        </w:rPr>
+      </w:pPr>
+      <w:r>
+        <w:rPr>
+          <w:sz w:val="22"/>
+          <w:szCs w:val="22"/>
+          <w:lang w:val="en-US"/>
+        </w:rPr>
+        <w:t>3. Tablero de predicciones</w:t>
+      </w:r>
+    </w:p>
+    <w:p xmlns:wp14="http://schemas.microsoft.com/office/word/2010/wordml" wp14:textId="77777777">
+      <w:pPr>
+        <w:pStyle w:val="Heading2"/>
+        <w:jc w:val="both"/>
+        <w:rPr>
+          <w:sz w:val="22"/>
+          <w:szCs w:val="22"/>
+          <w:lang w:val="en-US"/>
+        </w:rPr>
+      </w:pPr>
+      <w:r>
+        <w:rPr>
+          <w:sz w:val="22"/>
+          <w:szCs w:val="22"/>
+          <w:lang w:val="en-US"/>
+        </w:rPr>
+        <w:t>3.1 Arquitectura funcional</w:t>
+      </w:r>
+    </w:p>
+    <w:p xmlns:wp14="http://schemas.microsoft.com/office/word/2010/wordml" wp14:textId="77777777">
+      <w:pPr>
+        <w:spacing w:before="0" w:after="40" w:line="240" w:lineRule="auto"/>
+        <w:jc w:val="both"/>
+        <w:rPr>
+          <w:sz w:val="22"/>
+          <w:szCs w:val="22"/>
+          <w:lang w:val="en-US"/>
+        </w:rPr>
+      </w:pPr>
+      <w:r>
+        <w:rPr>
+          <w:rFonts w:ascii="Arial" w:hAnsi="Arial" w:eastAsia="Arial" w:cs="Arial"/>
+          <w:b w:val="0"/>
+          <w:bCs w:val="0"/>
+          <w:i w:val="0"/>
+          <w:iCs w:val="0"/>
+          <w:color w:val="203040"/>
+          <w:sz w:val="22"/>
+          <w:szCs w:val="22"/>
+          <w:lang w:val="en-US"/>
+        </w:rPr>
+        <w:t xml:space="preserve">La arquitectura separa inferencia y presentación. Un input mensual con dos filas (Bucaramanga y Cali) y exactamente 39 features contractuales alimenta el Champion; éste produce cuatro predicciones (dos ciudades × T+1/T+2). FastAPI /api/v2 valida el contrato y persiste el ChampionResult en SQLite. El dashboard React/Vite consume resultados por HTTP y no ejecuta el modelo ni recalcula probability, threshold o label.</w:t>
+      </w:r>
+      <w:r>
+        <w:rPr>
+          <w:rtl w:val="0"/>
+        </w:rPr>
+      </w:r>
+    </w:p>
+    <w:p>
+      <w:pPr>
+        <w:shd w:val="clear" w:color="auto" w:fill="F5F8FC"/>
+        <w:spacing w:before="30" w:after="40" w:line="240" w:lineRule="auto"/>
+        <w:ind w:left="216" w:right="216" w:firstLine="0"/>
+        <w:jc w:val="both"/>
+        <w:rPr>
+          <w:rFonts w:ascii="Arial" w:hAnsi="Arial" w:eastAsia="Arial" w:cs="Arial"/>
+          <w:b w:val="0"/>
+          <w:bCs w:val="0"/>
+          <w:i w:val="1"/>
+          <w:iCs w:val="1"/>
+          <w:color w:val="5B677A"/>
+          <w:sz w:val="22"/>
+          <w:szCs w:val="22"/>
+          <w:lang w:val="en-US"/>
+        </w:rPr>
+      </w:pPr>
+      <w:r>
+        <w:drawing>
+          <wp:inline wp14:editId="52C14517" wp14:anchorId="230D4E66">
+            <wp:extent cx="6055372" cy="3619500"/>
+            <wp:effectExtent l="0" t="0" r="0" b="0"/>
+            <wp:docPr id="721287292" name="drawing"/>
+            <wp:cNvGraphicFramePr>
+              <a:graphicFrameLocks noChangeAspect="1"/>
+            </wp:cNvGraphicFramePr>
+            <a:graphic>
+              <a:graphicData xmlns:a="http://schemas.openxmlformats.org/drawingml/2006/main" uri="http://schemas.openxmlformats.org/drawingml/2006/picture">
+                <pic:pic xmlns:pic="http://schemas.openxmlformats.org/drawingml/2006/picture">
+                  <pic:nvPicPr>
+                    <pic:cNvPr id="721287292" name="Picture 721287292"/>
+                    <pic:cNvPicPr/>
+                  </pic:nvPicPr>
+                  <pic:blipFill>
+                    <a:blip xmlns:r="http://schemas.openxmlformats.org/officeDocument/2006/relationships" r:embed="rId428543849">
+                      <a:extLst>
+                        <a:ext uri="{28A0092B-C50C-407E-A947-70E740481C1C}">
+                          <a14:useLocalDpi xmlns:a14="http://schemas.microsoft.com/office/drawing/2010/main"/>
+                        </a:ext>
+                      </a:extLst>
+                    </a:blip>
+                    <a:stretch>
+                      <a:fillRect/>
+                    </a:stretch>
+                  </pic:blipFill>
+                  <pic:spPr>
+                    <a:xfrm rot="0">
+                      <a:off x="0" y="0"/>
+                      <a:ext cx="6055372" cy="3619500"/>
+                    </a:xfrm>
+                    <a:prstGeom prst="rect">
+                      <a:avLst/>
+                    </a:prstGeom>
                   </pic:spPr>
                 </pic:pic>
               </a:graphicData>
@@ -5579,131 +6091,23 @@
       </w:r>
     </w:p>
     <w:p>
-      <w:r>
-        <w:rPr>
-          <w:i/>
-        </w:rPr>
-        <w:t>Figura: Curvas ROC y Precision-Recall — conjunto de prueba (2024-2025)</w:t>
-      </w:r>
-    </w:p>
-    <w:p xmlns:wp14="http://schemas.microsoft.com/office/word/2010/wordml" wp14:textId="77777777">
       <w:pPr>
         <w:shd w:val="clear" w:color="auto" w:fill="F5F8FC"/>
         <w:spacing w:before="30" w:after="40" w:line="240" w:lineRule="auto"/>
         <w:ind w:left="216" w:right="216" w:firstLine="0"/>
         <w:jc w:val="both"/>
         <w:rPr>
-          <w:sz w:val="22"/>
-          <w:szCs w:val="22"/>
-          <w:lang w:val="en-US"/>
-        </w:rPr>
-      </w:pPr>
-      <w:r>
-        <w:drawing>
-          <wp:inline>
-            <wp:extent cx="5029200" cy="2235200"/>
-            <wp:docPr id="2033299070" name="Picture 2033299070"/>
-            <wp:cNvGraphicFramePr>
-              <a:graphicFrameLocks noChangeAspect="1"/>
-            </wp:cNvGraphicFramePr>
-            <a:graphic>
-              <a:graphicData uri="http://schemas.openxmlformats.org/drawingml/2006/picture">
-                <pic:pic>
-                  <pic:nvPicPr>
-                    <pic:cNvPr id="0" name="report_inicios_brote.png"/>
-                    <pic:cNvPicPr/>
-                  </pic:nvPicPr>
-                  <pic:blipFill>
-                    <a:blip r:embed="rId7"/>
-                    <a:stretch>
-                      <a:fillRect/>
-                    </a:stretch>
-                  </pic:blipFill>
-                  <pic:spPr>
-                    <a:xfrm>
-                      <a:off x="0" y="0"/>
-                      <a:ext cx="5029200" cy="2235200"/>
-                    </a:xfrm>
-                    <a:prstGeom prst="rect"/>
-                  </pic:spPr>
-                </pic:pic>
-              </a:graphicData>
-            </a:graphic>
-          </wp:inline>
-        </w:drawing>
-      </w:r>
-    </w:p>
-    <w:p>
-      <w:r>
-        <w:rPr>
-          <w:i/>
-        </w:rPr>
-        <w:t>Figura: Detección de inicios de brote por modelo — conjunto de prueba (2024-2025)</w:t>
-      </w:r>
-    </w:p>
-    <w:p xmlns:wp14="http://schemas.microsoft.com/office/word/2010/wordml" wp14:textId="77777777">
-      <w:pPr>
-        <w:pStyle w:val="Heading2"/>
-        <w:jc w:val="both"/>
-        <w:rPr>
-          <w:sz w:val="22"/>
-          <w:szCs w:val="22"/>
-        </w:rPr>
-      </w:pPr>
-      <w:r>
-        <w:rPr>
-          <w:rtl w:val="0"/>
-        </w:rPr>
-      </w:r>
-    </w:p>
-    <w:p xmlns:wp14="http://schemas.microsoft.com/office/word/2010/wordml" wp14:textId="77777777">
-      <w:pPr>
-        <w:pStyle w:val="Heading2"/>
-        <w:jc w:val="both"/>
-        <w:rPr>
-          <w:sz w:val="22"/>
-          <w:szCs w:val="22"/>
-          <w:lang w:val="en-US"/>
-        </w:rPr>
-      </w:pPr>
-      <w:r>
-        <w:rPr>
-          <w:sz w:val="22"/>
-          <w:szCs w:val="22"/>
-          <w:lang w:val="en-US"/>
-        </w:rPr>
-        <w:t>2.4 Gestión de experimentos con MLflow</w:t>
-      </w:r>
-    </w:p>
-    <w:p xmlns:wp14="http://schemas.microsoft.com/office/word/2010/wordml" wp14:textId="77777777">
-      <w:pPr>
-        <w:spacing w:before="0" w:after="40" w:line="240" w:lineRule="auto"/>
-        <w:jc w:val="both"/>
-        <w:rPr>
-          <w:sz w:val="22"/>
-          <w:szCs w:val="22"/>
-          <w:lang w:val="en-US"/>
-        </w:rPr>
-      </w:pPr>
-      <w:r>
-        <w:rPr>
           <w:rFonts w:ascii="Arial" w:hAnsi="Arial" w:eastAsia="Arial" w:cs="Arial"/>
           <w:b w:val="0"/>
           <w:bCs w:val="0"/>
-          <w:i w:val="0"/>
-          <w:iCs w:val="0"/>
-          <w:color w:val="203040"/>
+          <w:i w:val="1"/>
+          <w:iCs w:val="1"/>
+          <w:color w:val="5B677A"/>
           <w:sz w:val="22"/>
           <w:szCs w:val="22"/>
           <w:lang w:val="en-US"/>
         </w:rPr>
-        <w:t xml:space="preserve">Los experimentos vigentes se registran en MLflow bajo sat-dengue. Cada corrida conserva parámetros, horizonte, conjunto evaluado, métricas, umbral y artefactos. La convención de alcance separa las métricas de los dos municipios, las nacionales y las específicas por DIVIPOLA. Esta normalización evita comparar números calculados sobre universos diferentes y permite rastrear el modelo desplegado frente a sus corridas.</w:t>
-      </w:r>
-      <w:r>
-        <w:rPr>
-          <w:rtl w:val="0"/>
-        </w:rPr>
-      </w:r>
+      </w:pPr>
     </w:p>
     <w:p xmlns:wp14="http://schemas.microsoft.com/office/word/2010/wordml" wp14:textId="77777777">
       <w:pPr>
@@ -5729,158 +6133,19 @@
           <w:szCs w:val="22"/>
           <w:lang w:val="en-US"/>
         </w:rPr>
-        <w:t xml:space="preserve">[Imagen "Vista de MLflow filtrada por params.conjunto = prueba, mostrando corridas T+1/T+2 y métricas usadas en la comparación final"]</w:t>
+        <w:t xml:space="preserve">[Imagen "Diagrama de arquitectura final de </w:t>
       </w:r>
       <w:r>
         <w:rPr>
-          <w:rtl w:val="0"/>
-        </w:rPr>
+          <w:i w:val="1"/>
+          <w:iCs w:val="1"/>
+          <w:color w:val="5b677a"/>
+          <w:sz w:val="22"/>
+          <w:szCs w:val="22"/>
+          <w:lang w:val="en-US"/>
+        </w:rPr>
+        <w:t xml:space="preserve">SAT_Dengue</w:t>
       </w:r>
-    </w:p>
-    <w:p xmlns:wp14="http://schemas.microsoft.com/office/word/2010/wordml" wp14:textId="77777777">
-      <w:pPr>
-        <w:pStyle w:val="Heading2"/>
-        <w:jc w:val="both"/>
-        <w:rPr>
-          <w:sz w:val="22"/>
-          <w:szCs w:val="22"/>
-        </w:rPr>
-      </w:pPr>
-      <w:r>
-        <w:rPr>
-          <w:rtl w:val="0"/>
-        </w:rPr>
-      </w:r>
-    </w:p>
-    <w:p xmlns:wp14="http://schemas.microsoft.com/office/word/2010/wordml" wp14:textId="77777777">
-      <w:pPr>
-        <w:pStyle w:val="Heading2"/>
-        <w:jc w:val="both"/>
-        <w:rPr>
-          <w:sz w:val="22"/>
-          <w:szCs w:val="22"/>
-          <w:lang w:val="en-US"/>
-        </w:rPr>
-      </w:pPr>
-      <w:r>
-        <w:rPr>
-          <w:sz w:val="22"/>
-          <w:szCs w:val="22"/>
-          <w:lang w:val="en-US"/>
-        </w:rPr>
-        <w:t>2.5 Evaluación comparativa y selección del Champion</w:t>
-      </w:r>
-    </w:p>
-    <w:p xmlns:wp14="http://schemas.microsoft.com/office/word/2010/wordml" wp14:textId="77777777">
-      <w:pPr>
-        <w:spacing w:before="0" w:after="40" w:line="240" w:lineRule="auto"/>
-        <w:jc w:val="both"/>
-        <w:rPr>
-          <w:sz w:val="22"/>
-          <w:szCs w:val="22"/>
-          <w:lang w:val="en-US"/>
-        </w:rPr>
-      </w:pPr>
-      <w:r>
-        <w:rPr>
-          <w:rFonts w:ascii="Arial" w:hAnsi="Arial" w:eastAsia="Arial" w:cs="Arial"/>
-          <w:b w:val="0"/>
-          <w:bCs w:val="0"/>
-          <w:i w:val="0"/>
-          <w:iCs w:val="0"/>
-          <w:color w:val="203040"/>
-          <w:sz w:val="22"/>
-          <w:szCs w:val="22"/>
-          <w:lang w:val="en-US"/>
-        </w:rPr>
-        <w:t xml:space="preserve">XGBoost se mantiene como Champion desplegado porque es la alternativa integrada, calibrada y validada de extremo a extremo contra el contrato de 39 features. Esta elección es de integración y reproducibilidad del producto, no una afirmación de superioridad absoluta: en T+1 empata con LightGBM en F1 e inicios, y en T+2 LightGBM muestra mejor detección de inicios. La evidencia actual obliga a separar “mejor integrado” de “mejor predictor”.</w:t>
-      </w:r>
-      <w:r>
-        <w:rPr>
-          <w:rtl w:val="0"/>
-        </w:rPr>
-      </w:r>
-    </w:p>
-    <w:p xmlns:wp14="http://schemas.microsoft.com/office/word/2010/wordml" wp14:textId="77777777">
-      <w:pPr>
-        <w:pStyle w:val="Heading1"/>
-        <w:jc w:val="center"/>
-        <w:rPr>
-          <w:sz w:val="22"/>
-          <w:szCs w:val="22"/>
-          <w:lang w:val="en-US"/>
-        </w:rPr>
-      </w:pPr>
-      <w:r>
-        <w:rPr>
-          <w:sz w:val="22"/>
-          <w:szCs w:val="22"/>
-          <w:lang w:val="en-US"/>
-        </w:rPr>
-        <w:t>3. Tablero de predicciones</w:t>
-      </w:r>
-    </w:p>
-    <w:p xmlns:wp14="http://schemas.microsoft.com/office/word/2010/wordml" wp14:textId="77777777">
-      <w:pPr>
-        <w:pStyle w:val="Heading2"/>
-        <w:jc w:val="both"/>
-        <w:rPr>
-          <w:sz w:val="22"/>
-          <w:szCs w:val="22"/>
-          <w:lang w:val="en-US"/>
-        </w:rPr>
-      </w:pPr>
-      <w:r>
-        <w:rPr>
-          <w:sz w:val="22"/>
-          <w:szCs w:val="22"/>
-          <w:lang w:val="en-US"/>
-        </w:rPr>
-        <w:t>3.1 Arquitectura funcional</w:t>
-      </w:r>
-    </w:p>
-    <w:p xmlns:wp14="http://schemas.microsoft.com/office/word/2010/wordml" wp14:textId="77777777">
-      <w:pPr>
-        <w:spacing w:before="0" w:after="40" w:line="240" w:lineRule="auto"/>
-        <w:jc w:val="both"/>
-        <w:rPr>
-          <w:sz w:val="22"/>
-          <w:szCs w:val="22"/>
-          <w:lang w:val="en-US"/>
-        </w:rPr>
-      </w:pPr>
-      <w:r>
-        <w:rPr>
-          <w:rFonts w:ascii="Arial" w:hAnsi="Arial" w:eastAsia="Arial" w:cs="Arial"/>
-          <w:b w:val="0"/>
-          <w:bCs w:val="0"/>
-          <w:i w:val="0"/>
-          <w:iCs w:val="0"/>
-          <w:color w:val="203040"/>
-          <w:sz w:val="22"/>
-          <w:szCs w:val="22"/>
-          <w:lang w:val="en-US"/>
-        </w:rPr>
-        <w:t xml:space="preserve">La arquitectura separa inferencia y presentación. Un input mensual con dos filas (Bucaramanga y Cali) y exactamente 39 features contractuales alimenta el Champion; éste produce cuatro predicciones (dos ciudades × T+1/T+2). FastAPI /api/v2 valida el contrato y persiste el ChampionResult en SQLite. El dashboard React/Vite consume resultados por HTTP y no ejecuta el modelo ni recalcula probability, threshold o label.</w:t>
-      </w:r>
-      <w:r>
-        <w:rPr>
-          <w:rtl w:val="0"/>
-        </w:rPr>
-      </w:r>
-    </w:p>
-    <w:p xmlns:wp14="http://schemas.microsoft.com/office/word/2010/wordml" wp14:textId="77777777">
-      <w:pPr>
-        <w:shd w:val="clear" w:color="auto" w:fill="F5F8FC"/>
-        <w:spacing w:before="30" w:after="40" w:line="240" w:lineRule="auto"/>
-        <w:ind w:left="216" w:right="216" w:firstLine="0"/>
-        <w:jc w:val="both"/>
-        <w:rPr>
-          <w:sz w:val="22"/>
-          <w:szCs w:val="22"/>
-          <w:lang w:val="en-US"/>
-        </w:rPr>
-      </w:pPr>
       <w:sdt>
         <w:sdtPr>
           <w:id w:val="1676541920"/>
@@ -5907,46 +6172,9 @@
         </w:sdtContent>
       </w:sdt>
       <w:r>
-        <w:drawing>
-          <wp:inline>
-            <wp:extent cx="5029200" cy="2300177"/>
-            <wp:docPr id="2033299073" name="Picture 2033299073"/>
-            <wp:cNvGraphicFramePr>
-              <a:graphicFrameLocks noChangeAspect="1"/>
-            </wp:cNvGraphicFramePr>
-            <a:graphic>
-              <a:graphicData uri="http://schemas.openxmlformats.org/drawingml/2006/picture">
-                <pic:pic>
-                  <pic:nvPicPr>
-                    <pic:cNvPr id="0" name="sat_dengue_arquitectura.png"/>
-                    <pic:cNvPicPr/>
-                  </pic:nvPicPr>
-                  <pic:blipFill>
-                    <a:blip r:embed="rId16"/>
-                    <a:stretch>
-                      <a:fillRect/>
-                    </a:stretch>
-                  </pic:blipFill>
-                  <pic:spPr>
-                    <a:xfrm>
-                      <a:off x="0" y="0"/>
-                      <a:ext cx="5029200" cy="2300177"/>
-                    </a:xfrm>
-                    <a:prstGeom prst="rect"/>
-                  </pic:spPr>
-                </pic:pic>
-              </a:graphicData>
-            </a:graphic>
-          </wp:inline>
-        </w:drawing>
-      </w:r>
-    </w:p>
-    <w:p>
-      <w:r>
-        <w:rPr>
-          <w:i/>
-        </w:rPr>
-        <w:t>Figura: Arquitectura del sistema SAT-Dengue en producción</w:t>
+        <w:rPr>
+          <w:rtl w:val="0"/>
+        </w:rPr>
       </w:r>
     </w:p>
     <w:p xmlns:wp14="http://schemas.microsoft.com/office/word/2010/wordml" wp14:textId="77777777">

</xml_diff>